<commit_message>
add in grid_bucket treatment
</commit_message>
<xml_diff>
--- a/Preliminary_results.docx
+++ b/Preliminary_results.docx
@@ -26,7 +26,7 @@
         <w:t xml:space="preserve">2026-06-02</w:t>
       </w:r>
     </w:p>
-    <w:bookmarkStart w:id="21" w:name="preliminary-analysis"/>
+    <w:bookmarkStart w:id="24" w:name="preliminary-analysis"/>
     <w:p>
       <w:pPr>
         <w:pStyle w:val="Heading2"/>
@@ -3305,7 +3305,804 @@
         <w:t xml:space="preserve">A little confusing because it re-ordered the panels, with bucket coming first here.</w:t>
       </w:r>
     </w:p>
-    <w:bookmarkEnd w:id="21"/>
+    <w:p>
+      <w:pPr>
+        <w:pStyle w:val="BodyText"/>
+      </w:pPr>
+      <w:r>
+        <w:t xml:space="preserve">Lastly, I integrated grid treatment and bucket into one treatment.</w:t>
+      </w:r>
+    </w:p>
+    <w:p>
+      <w:pPr>
+        <w:pStyle w:val="BodyText"/>
+      </w:pPr>
+      <w:r>
+        <w:t xml:space="preserve">Control + no bucket = regular density + no food</w:t>
+      </w:r>
+      <w:r>
+        <w:t xml:space="preserve"> </w:t>
+      </w:r>
+      <w:r>
+        <w:t xml:space="preserve">Food add + no bucket = high density + no food</w:t>
+      </w:r>
+      <w:r>
+        <w:t xml:space="preserve"> </w:t>
+      </w:r>
+      <w:r>
+        <w:t xml:space="preserve">Food add + bucket = high density + food</w:t>
+      </w:r>
+      <w:r>
+        <w:t xml:space="preserve"> </w:t>
+      </w:r>
+      <w:r>
+        <w:t xml:space="preserve">Rattle + no bucket = percieved high density + no food</w:t>
+      </w:r>
+    </w:p>
+    <w:p>
+      <w:pPr>
+        <w:pStyle w:val="SourceCode"/>
+      </w:pPr>
+      <w:r>
+        <w:rPr>
+          <w:rStyle w:val="CommentTok"/>
+        </w:rPr>
+        <w:t xml:space="preserve">#make model for growth ~ litter size * food add</w:t>
+      </w:r>
+      <w:r>
+        <w:br/>
+      </w:r>
+      <w:r>
+        <w:rPr>
+          <w:rStyle w:val="NormalTok"/>
+        </w:rPr>
+        <w:t xml:space="preserve">tbmod </w:t>
+      </w:r>
+      <w:r>
+        <w:rPr>
+          <w:rStyle w:val="OtherTok"/>
+        </w:rPr>
+        <w:t xml:space="preserve">&lt;-</w:t>
+      </w:r>
+      <w:r>
+        <w:rPr>
+          <w:rStyle w:val="NormalTok"/>
+        </w:rPr>
+        <w:t xml:space="preserve"> </w:t>
+      </w:r>
+      <w:r>
+        <w:rPr>
+          <w:rStyle w:val="FunctionTok"/>
+        </w:rPr>
+        <w:t xml:space="preserve">lm</w:t>
+      </w:r>
+      <w:r>
+        <w:rPr>
+          <w:rStyle w:val="NormalTok"/>
+        </w:rPr>
+        <w:t xml:space="preserve">(growthrate </w:t>
+      </w:r>
+      <w:r>
+        <w:rPr>
+          <w:rStyle w:val="SpecialCharTok"/>
+        </w:rPr>
+        <w:t xml:space="preserve">~</w:t>
+      </w:r>
+      <w:r>
+        <w:rPr>
+          <w:rStyle w:val="NormalTok"/>
+        </w:rPr>
+        <w:t xml:space="preserve"> litterf </w:t>
+      </w:r>
+      <w:r>
+        <w:rPr>
+          <w:rStyle w:val="SpecialCharTok"/>
+        </w:rPr>
+        <w:t xml:space="preserve">+</w:t>
+      </w:r>
+      <w:r>
+        <w:rPr>
+          <w:rStyle w:val="NormalTok"/>
+        </w:rPr>
+        <w:t xml:space="preserve"> density</w:t>
+      </w:r>
+      <w:r>
+        <w:rPr>
+          <w:rStyle w:val="SpecialCharTok"/>
+        </w:rPr>
+        <w:t xml:space="preserve">*</w:t>
+      </w:r>
+      <w:r>
+        <w:rPr>
+          <w:rStyle w:val="NormalTok"/>
+        </w:rPr>
+        <w:t xml:space="preserve">treatment_bucket, dat)</w:t>
+      </w:r>
+      <w:r>
+        <w:br/>
+      </w:r>
+      <w:r>
+        <w:br/>
+      </w:r>
+      <w:r>
+        <w:rPr>
+          <w:rStyle w:val="CommentTok"/>
+        </w:rPr>
+        <w:t xml:space="preserve">#get effects table for model</w:t>
+      </w:r>
+      <w:r>
+        <w:br/>
+      </w:r>
+      <w:r>
+        <w:rPr>
+          <w:rStyle w:val="NormalTok"/>
+        </w:rPr>
+        <w:t xml:space="preserve">tb_effs </w:t>
+      </w:r>
+      <w:r>
+        <w:rPr>
+          <w:rStyle w:val="OtherTok"/>
+        </w:rPr>
+        <w:t xml:space="preserve">&lt;-</w:t>
+      </w:r>
+      <w:r>
+        <w:rPr>
+          <w:rStyle w:val="NormalTok"/>
+        </w:rPr>
+        <w:t xml:space="preserve"> </w:t>
+      </w:r>
+      <w:r>
+        <w:rPr>
+          <w:rStyle w:val="FunctionTok"/>
+        </w:rPr>
+        <w:t xml:space="preserve">as.data.table</w:t>
+      </w:r>
+      <w:r>
+        <w:rPr>
+          <w:rStyle w:val="NormalTok"/>
+        </w:rPr>
+        <w:t xml:space="preserve">(</w:t>
+      </w:r>
+      <w:r>
+        <w:rPr>
+          <w:rStyle w:val="FunctionTok"/>
+        </w:rPr>
+        <w:t xml:space="preserve">ggpredict</w:t>
+      </w:r>
+      <w:r>
+        <w:rPr>
+          <w:rStyle w:val="NormalTok"/>
+        </w:rPr>
+        <w:t xml:space="preserve">(tbmod, </w:t>
+      </w:r>
+      <w:r>
+        <w:rPr>
+          <w:rStyle w:val="AttributeTok"/>
+        </w:rPr>
+        <w:t xml:space="preserve">terms =</w:t>
+      </w:r>
+      <w:r>
+        <w:rPr>
+          <w:rStyle w:val="NormalTok"/>
+        </w:rPr>
+        <w:t xml:space="preserve"> </w:t>
+      </w:r>
+      <w:r>
+        <w:rPr>
+          <w:rStyle w:val="FunctionTok"/>
+        </w:rPr>
+        <w:t xml:space="preserve">c</w:t>
+      </w:r>
+      <w:r>
+        <w:rPr>
+          <w:rStyle w:val="NormalTok"/>
+        </w:rPr>
+        <w:t xml:space="preserve">(</w:t>
+      </w:r>
+      <w:r>
+        <w:rPr>
+          <w:rStyle w:val="StringTok"/>
+        </w:rPr>
+        <w:t xml:space="preserve">"density"</w:t>
+      </w:r>
+      <w:r>
+        <w:rPr>
+          <w:rStyle w:val="NormalTok"/>
+        </w:rPr>
+        <w:t xml:space="preserve">, </w:t>
+      </w:r>
+      <w:r>
+        <w:rPr>
+          <w:rStyle w:val="StringTok"/>
+        </w:rPr>
+        <w:t xml:space="preserve">"litterf"</w:t>
+      </w:r>
+      <w:r>
+        <w:rPr>
+          <w:rStyle w:val="NormalTok"/>
+        </w:rPr>
+        <w:t xml:space="preserve">, </w:t>
+      </w:r>
+      <w:r>
+        <w:rPr>
+          <w:rStyle w:val="StringTok"/>
+        </w:rPr>
+        <w:t xml:space="preserve">"treatment_bucket"</w:t>
+      </w:r>
+      <w:r>
+        <w:rPr>
+          <w:rStyle w:val="NormalTok"/>
+        </w:rPr>
+        <w:t xml:space="preserve">)))</w:t>
+      </w:r>
+      <w:r>
+        <w:br/>
+      </w:r>
+      <w:r>
+        <w:br/>
+      </w:r>
+      <w:r>
+        <w:rPr>
+          <w:rStyle w:val="FunctionTok"/>
+        </w:rPr>
+        <w:t xml:space="preserve">ggplot</w:t>
+      </w:r>
+      <w:r>
+        <w:rPr>
+          <w:rStyle w:val="NormalTok"/>
+        </w:rPr>
+        <w:t xml:space="preserve">(tb_effs)</w:t>
+      </w:r>
+      <w:r>
+        <w:rPr>
+          <w:rStyle w:val="SpecialCharTok"/>
+        </w:rPr>
+        <w:t xml:space="preserve">+</w:t>
+      </w:r>
+      <w:r>
+        <w:br/>
+      </w:r>
+      <w:r>
+        <w:rPr>
+          <w:rStyle w:val="NormalTok"/>
+        </w:rPr>
+        <w:t xml:space="preserve">  </w:t>
+      </w:r>
+      <w:r>
+        <w:rPr>
+          <w:rStyle w:val="FunctionTok"/>
+        </w:rPr>
+        <w:t xml:space="preserve">geom_ribbon</w:t>
+      </w:r>
+      <w:r>
+        <w:rPr>
+          <w:rStyle w:val="NormalTok"/>
+        </w:rPr>
+        <w:t xml:space="preserve">(</w:t>
+      </w:r>
+      <w:r>
+        <w:rPr>
+          <w:rStyle w:val="FunctionTok"/>
+        </w:rPr>
+        <w:t xml:space="preserve">aes</w:t>
+      </w:r>
+      <w:r>
+        <w:rPr>
+          <w:rStyle w:val="NormalTok"/>
+        </w:rPr>
+        <w:t xml:space="preserve">(</w:t>
+      </w:r>
+      <w:r>
+        <w:rPr>
+          <w:rStyle w:val="AttributeTok"/>
+        </w:rPr>
+        <w:t xml:space="preserve">x =</w:t>
+      </w:r>
+      <w:r>
+        <w:rPr>
+          <w:rStyle w:val="NormalTok"/>
+        </w:rPr>
+        <w:t xml:space="preserve"> x, </w:t>
+      </w:r>
+      <w:r>
+        <w:rPr>
+          <w:rStyle w:val="AttributeTok"/>
+        </w:rPr>
+        <w:t xml:space="preserve">ymin =</w:t>
+      </w:r>
+      <w:r>
+        <w:rPr>
+          <w:rStyle w:val="NormalTok"/>
+        </w:rPr>
+        <w:t xml:space="preserve"> conf.low, </w:t>
+      </w:r>
+      <w:r>
+        <w:rPr>
+          <w:rStyle w:val="AttributeTok"/>
+        </w:rPr>
+        <w:t xml:space="preserve">ymax =</w:t>
+      </w:r>
+      <w:r>
+        <w:rPr>
+          <w:rStyle w:val="NormalTok"/>
+        </w:rPr>
+        <w:t xml:space="preserve"> conf.high, </w:t>
+      </w:r>
+      <w:r>
+        <w:rPr>
+          <w:rStyle w:val="AttributeTok"/>
+        </w:rPr>
+        <w:t xml:space="preserve">group =</w:t>
+      </w:r>
+      <w:r>
+        <w:rPr>
+          <w:rStyle w:val="NormalTok"/>
+        </w:rPr>
+        <w:t xml:space="preserve"> group, </w:t>
+      </w:r>
+      <w:r>
+        <w:rPr>
+          <w:rStyle w:val="AttributeTok"/>
+        </w:rPr>
+        <w:t xml:space="preserve">fill =</w:t>
+      </w:r>
+      <w:r>
+        <w:rPr>
+          <w:rStyle w:val="NormalTok"/>
+        </w:rPr>
+        <w:t xml:space="preserve"> group), </w:t>
+      </w:r>
+      <w:r>
+        <w:rPr>
+          <w:rStyle w:val="AttributeTok"/>
+        </w:rPr>
+        <w:t xml:space="preserve">alpha =</w:t>
+      </w:r>
+      <w:r>
+        <w:rPr>
+          <w:rStyle w:val="NormalTok"/>
+        </w:rPr>
+        <w:t xml:space="preserve"> </w:t>
+      </w:r>
+      <w:r>
+        <w:rPr>
+          <w:rStyle w:val="FloatTok"/>
+        </w:rPr>
+        <w:t xml:space="preserve">0.2</w:t>
+      </w:r>
+      <w:r>
+        <w:rPr>
+          <w:rStyle w:val="NormalTok"/>
+        </w:rPr>
+        <w:t xml:space="preserve">)</w:t>
+      </w:r>
+      <w:r>
+        <w:rPr>
+          <w:rStyle w:val="SpecialCharTok"/>
+        </w:rPr>
+        <w:t xml:space="preserve">+</w:t>
+      </w:r>
+      <w:r>
+        <w:br/>
+      </w:r>
+      <w:r>
+        <w:rPr>
+          <w:rStyle w:val="NormalTok"/>
+        </w:rPr>
+        <w:t xml:space="preserve">  </w:t>
+      </w:r>
+      <w:r>
+        <w:rPr>
+          <w:rStyle w:val="FunctionTok"/>
+        </w:rPr>
+        <w:t xml:space="preserve">geom_line</w:t>
+      </w:r>
+      <w:r>
+        <w:rPr>
+          <w:rStyle w:val="NormalTok"/>
+        </w:rPr>
+        <w:t xml:space="preserve">(</w:t>
+      </w:r>
+      <w:r>
+        <w:rPr>
+          <w:rStyle w:val="FunctionTok"/>
+        </w:rPr>
+        <w:t xml:space="preserve">aes</w:t>
+      </w:r>
+      <w:r>
+        <w:rPr>
+          <w:rStyle w:val="NormalTok"/>
+        </w:rPr>
+        <w:t xml:space="preserve">(</w:t>
+      </w:r>
+      <w:r>
+        <w:rPr>
+          <w:rStyle w:val="AttributeTok"/>
+        </w:rPr>
+        <w:t xml:space="preserve">y =</w:t>
+      </w:r>
+      <w:r>
+        <w:rPr>
+          <w:rStyle w:val="NormalTok"/>
+        </w:rPr>
+        <w:t xml:space="preserve"> predicted, </w:t>
+      </w:r>
+      <w:r>
+        <w:rPr>
+          <w:rStyle w:val="AttributeTok"/>
+        </w:rPr>
+        <w:t xml:space="preserve">x =</w:t>
+      </w:r>
+      <w:r>
+        <w:rPr>
+          <w:rStyle w:val="NormalTok"/>
+        </w:rPr>
+        <w:t xml:space="preserve"> x, </w:t>
+      </w:r>
+      <w:r>
+        <w:rPr>
+          <w:rStyle w:val="AttributeTok"/>
+        </w:rPr>
+        <w:t xml:space="preserve">color =</w:t>
+      </w:r>
+      <w:r>
+        <w:rPr>
+          <w:rStyle w:val="NormalTok"/>
+        </w:rPr>
+        <w:t xml:space="preserve"> group, </w:t>
+      </w:r>
+      <w:r>
+        <w:rPr>
+          <w:rStyle w:val="AttributeTok"/>
+        </w:rPr>
+        <w:t xml:space="preserve">group =</w:t>
+      </w:r>
+      <w:r>
+        <w:rPr>
+          <w:rStyle w:val="NormalTok"/>
+        </w:rPr>
+        <w:t xml:space="preserve"> group), </w:t>
+      </w:r>
+      <w:r>
+        <w:rPr>
+          <w:rStyle w:val="AttributeTok"/>
+        </w:rPr>
+        <w:t xml:space="preserve">linewidth =</w:t>
+      </w:r>
+      <w:r>
+        <w:rPr>
+          <w:rStyle w:val="NormalTok"/>
+        </w:rPr>
+        <w:t xml:space="preserve"> </w:t>
+      </w:r>
+      <w:r>
+        <w:rPr>
+          <w:rStyle w:val="DecValTok"/>
+        </w:rPr>
+        <w:t xml:space="preserve">1</w:t>
+      </w:r>
+      <w:r>
+        <w:rPr>
+          <w:rStyle w:val="NormalTok"/>
+        </w:rPr>
+        <w:t xml:space="preserve">)</w:t>
+      </w:r>
+      <w:r>
+        <w:rPr>
+          <w:rStyle w:val="SpecialCharTok"/>
+        </w:rPr>
+        <w:t xml:space="preserve">+</w:t>
+      </w:r>
+      <w:r>
+        <w:br/>
+      </w:r>
+      <w:r>
+        <w:rPr>
+          <w:rStyle w:val="NormalTok"/>
+        </w:rPr>
+        <w:t xml:space="preserve">  </w:t>
+      </w:r>
+      <w:r>
+        <w:rPr>
+          <w:rStyle w:val="FunctionTok"/>
+        </w:rPr>
+        <w:t xml:space="preserve">scale_color_discrete</w:t>
+      </w:r>
+      <w:r>
+        <w:rPr>
+          <w:rStyle w:val="NormalTok"/>
+        </w:rPr>
+        <w:t xml:space="preserve">(</w:t>
+      </w:r>
+      <w:r>
+        <w:rPr>
+          <w:rStyle w:val="AttributeTok"/>
+        </w:rPr>
+        <w:t xml:space="preserve">name =</w:t>
+      </w:r>
+      <w:r>
+        <w:rPr>
+          <w:rStyle w:val="NormalTok"/>
+        </w:rPr>
+        <w:t xml:space="preserve"> </w:t>
+      </w:r>
+      <w:r>
+        <w:rPr>
+          <w:rStyle w:val="StringTok"/>
+        </w:rPr>
+        <w:t xml:space="preserve">"Litter size"</w:t>
+      </w:r>
+      <w:r>
+        <w:rPr>
+          <w:rStyle w:val="NormalTok"/>
+        </w:rPr>
+        <w:t xml:space="preserve">)</w:t>
+      </w:r>
+      <w:r>
+        <w:rPr>
+          <w:rStyle w:val="SpecialCharTok"/>
+        </w:rPr>
+        <w:t xml:space="preserve">+</w:t>
+      </w:r>
+      <w:r>
+        <w:br/>
+      </w:r>
+      <w:r>
+        <w:rPr>
+          <w:rStyle w:val="NormalTok"/>
+        </w:rPr>
+        <w:t xml:space="preserve">  </w:t>
+      </w:r>
+      <w:r>
+        <w:rPr>
+          <w:rStyle w:val="FunctionTok"/>
+        </w:rPr>
+        <w:t xml:space="preserve">scale_fill_discrete</w:t>
+      </w:r>
+      <w:r>
+        <w:rPr>
+          <w:rStyle w:val="NormalTok"/>
+        </w:rPr>
+        <w:t xml:space="preserve">(</w:t>
+      </w:r>
+      <w:r>
+        <w:rPr>
+          <w:rStyle w:val="AttributeTok"/>
+        </w:rPr>
+        <w:t xml:space="preserve">name =</w:t>
+      </w:r>
+      <w:r>
+        <w:rPr>
+          <w:rStyle w:val="NormalTok"/>
+        </w:rPr>
+        <w:t xml:space="preserve"> </w:t>
+      </w:r>
+      <w:r>
+        <w:rPr>
+          <w:rStyle w:val="StringTok"/>
+        </w:rPr>
+        <w:t xml:space="preserve">"Litter size"</w:t>
+      </w:r>
+      <w:r>
+        <w:rPr>
+          <w:rStyle w:val="NormalTok"/>
+        </w:rPr>
+        <w:t xml:space="preserve">)</w:t>
+      </w:r>
+      <w:r>
+        <w:rPr>
+          <w:rStyle w:val="SpecialCharTok"/>
+        </w:rPr>
+        <w:t xml:space="preserve">+</w:t>
+      </w:r>
+      <w:r>
+        <w:br/>
+      </w:r>
+      <w:r>
+        <w:rPr>
+          <w:rStyle w:val="NormalTok"/>
+        </w:rPr>
+        <w:t xml:space="preserve">  </w:t>
+      </w:r>
+      <w:r>
+        <w:rPr>
+          <w:rStyle w:val="FunctionTok"/>
+        </w:rPr>
+        <w:t xml:space="preserve">labs</w:t>
+      </w:r>
+      <w:r>
+        <w:rPr>
+          <w:rStyle w:val="NormalTok"/>
+        </w:rPr>
+        <w:t xml:space="preserve">(</w:t>
+      </w:r>
+      <w:r>
+        <w:rPr>
+          <w:rStyle w:val="AttributeTok"/>
+        </w:rPr>
+        <w:t xml:space="preserve">x =</w:t>
+      </w:r>
+      <w:r>
+        <w:rPr>
+          <w:rStyle w:val="NormalTok"/>
+        </w:rPr>
+        <w:t xml:space="preserve"> </w:t>
+      </w:r>
+      <w:r>
+        <w:rPr>
+          <w:rStyle w:val="StringTok"/>
+        </w:rPr>
+        <w:t xml:space="preserve">"Local density (squirrels/ha)"</w:t>
+      </w:r>
+      <w:r>
+        <w:rPr>
+          <w:rStyle w:val="NormalTok"/>
+        </w:rPr>
+        <w:t xml:space="preserve">, </w:t>
+      </w:r>
+      <w:r>
+        <w:rPr>
+          <w:rStyle w:val="AttributeTok"/>
+        </w:rPr>
+        <w:t xml:space="preserve">y =</w:t>
+      </w:r>
+      <w:r>
+        <w:rPr>
+          <w:rStyle w:val="NormalTok"/>
+        </w:rPr>
+        <w:t xml:space="preserve"> </w:t>
+      </w:r>
+      <w:r>
+        <w:rPr>
+          <w:rStyle w:val="StringTok"/>
+        </w:rPr>
+        <w:t xml:space="preserve">"Growth rate (g/day)"</w:t>
+      </w:r>
+      <w:r>
+        <w:rPr>
+          <w:rStyle w:val="NormalTok"/>
+        </w:rPr>
+        <w:t xml:space="preserve">, </w:t>
+      </w:r>
+      <w:r>
+        <w:rPr>
+          <w:rStyle w:val="AttributeTok"/>
+        </w:rPr>
+        <w:t xml:space="preserve">subtitle =</w:t>
+      </w:r>
+      <w:r>
+        <w:rPr>
+          <w:rStyle w:val="NormalTok"/>
+        </w:rPr>
+        <w:t xml:space="preserve"> </w:t>
+      </w:r>
+      <w:r>
+        <w:rPr>
+          <w:rStyle w:val="StringTok"/>
+        </w:rPr>
+        <w:t xml:space="preserve">"Grid_Bucket"</w:t>
+      </w:r>
+      <w:r>
+        <w:rPr>
+          <w:rStyle w:val="NormalTok"/>
+        </w:rPr>
+        <w:t xml:space="preserve">)</w:t>
+      </w:r>
+      <w:r>
+        <w:rPr>
+          <w:rStyle w:val="SpecialCharTok"/>
+        </w:rPr>
+        <w:t xml:space="preserve">+</w:t>
+      </w:r>
+      <w:r>
+        <w:br/>
+      </w:r>
+      <w:r>
+        <w:rPr>
+          <w:rStyle w:val="NormalTok"/>
+        </w:rPr>
+        <w:t xml:space="preserve">  </w:t>
+      </w:r>
+      <w:r>
+        <w:rPr>
+          <w:rStyle w:val="FunctionTok"/>
+        </w:rPr>
+        <w:t xml:space="preserve">facet_wrap</w:t>
+      </w:r>
+      <w:r>
+        <w:rPr>
+          <w:rStyle w:val="NormalTok"/>
+        </w:rPr>
+        <w:t xml:space="preserve">(</w:t>
+      </w:r>
+      <w:r>
+        <w:rPr>
+          <w:rStyle w:val="SpecialCharTok"/>
+        </w:rPr>
+        <w:t xml:space="preserve">~</w:t>
+      </w:r>
+      <w:r>
+        <w:rPr>
+          <w:rStyle w:val="NormalTok"/>
+        </w:rPr>
+        <w:t xml:space="preserve">facet)</w:t>
+      </w:r>
+      <w:r>
+        <w:rPr>
+          <w:rStyle w:val="SpecialCharTok"/>
+        </w:rPr>
+        <w:t xml:space="preserve">+</w:t>
+      </w:r>
+      <w:r>
+        <w:br/>
+      </w:r>
+      <w:r>
+        <w:rPr>
+          <w:rStyle w:val="NormalTok"/>
+        </w:rPr>
+        <w:t xml:space="preserve">  </w:t>
+      </w:r>
+      <w:r>
+        <w:rPr>
+          <w:rStyle w:val="FunctionTok"/>
+        </w:rPr>
+        <w:t xml:space="preserve">theme_bw</w:t>
+      </w:r>
+      <w:r>
+        <w:rPr>
+          <w:rStyle w:val="NormalTok"/>
+        </w:rPr>
+        <w:t xml:space="preserve">()</w:t>
+      </w:r>
+    </w:p>
+    <w:p>
+      <w:pPr>
+        <w:pStyle w:val="FirstParagraph"/>
+      </w:pPr>
+      <w:r>
+        <w:drawing>
+          <wp:inline>
+            <wp:extent cx="4620126" cy="3696101"/>
+            <wp:effectExtent b="0" l="0" r="0" t="0"/>
+            <wp:docPr descr="" title="" id="22" name="Picture"/>
+            <a:graphic>
+              <a:graphicData uri="http://schemas.openxmlformats.org/drawingml/2006/picture">
+                <pic:pic>
+                  <pic:nvPicPr>
+                    <pic:cNvPr descr="Preliminary_results_files/Preliminary_results_files/figure-docx/fig 5-1.png" id="23" name="Picture"/>
+                    <pic:cNvPicPr>
+                      <a:picLocks noChangeArrowheads="1" noChangeAspect="1"/>
+                    </pic:cNvPicPr>
+                  </pic:nvPicPr>
+                  <pic:blipFill>
+                    <a:blip r:embed="rId21"/>
+                    <a:stretch>
+                      <a:fillRect/>
+                    </a:stretch>
+                  </pic:blipFill>
+                  <pic:spPr bwMode="auto">
+                    <a:xfrm>
+                      <a:off x="0" y="0"/>
+                      <a:ext cx="4620126" cy="3696101"/>
+                    </a:xfrm>
+                    <a:prstGeom prst="rect">
+                      <a:avLst/>
+                    </a:prstGeom>
+                    <a:noFill/>
+                    <a:ln w="9525">
+                      <a:noFill/>
+                      <a:headEnd/>
+                      <a:tailEnd/>
+                    </a:ln>
+                  </pic:spPr>
+                </pic:pic>
+              </a:graphicData>
+            </a:graphic>
+          </wp:inline>
+        </w:drawing>
+      </w:r>
+    </w:p>
+    <w:bookmarkEnd w:id="24"/>
     <w:sectPr>
       <w:footnotePr>
         <w:numRestart w:val="eachSect"/>

</xml_diff>

<commit_message>
add mixed model to results
</commit_message>
<xml_diff>
--- a/Preliminary_results.docx
+++ b/Preliminary_results.docx
@@ -26,7 +26,7 @@
         <w:t xml:space="preserve">2026-06-02</w:t>
       </w:r>
     </w:p>
-    <w:bookmarkStart w:id="18" w:name="preliminary-analysis"/>
+    <w:bookmarkStart w:id="21" w:name="preliminary-analysis"/>
     <w:p>
       <w:pPr>
         <w:pStyle w:val="Heading2"/>
@@ -2732,7 +2732,7 @@
               <a:graphicData uri="http://schemas.openxmlformats.org/drawingml/2006/picture">
                 <pic:pic>
                   <pic:nvPicPr>
-                    <pic:cNvPr descr="Preliminary_results_files/Preliminary_results_files/figure-docx/fig 4-1.png" id="17" name="Picture"/>
+                    <pic:cNvPr descr="Preliminary_results_files/Preliminary_results_files/figure-docx/fig 3-1.png" id="17" name="Picture"/>
                     <pic:cNvPicPr>
                       <a:picLocks noChangeArrowheads="1" noChangeAspect="1"/>
                     </pic:cNvPicPr>
@@ -2765,7 +2765,1209 @@
         </w:drawing>
       </w:r>
     </w:p>
-    <w:bookmarkEnd w:id="18"/>
+    <w:p>
+      <w:pPr>
+        <w:pStyle w:val="SourceCode"/>
+      </w:pPr>
+      <w:r>
+        <w:rPr>
+          <w:rStyle w:val="CommentTok"/>
+        </w:rPr>
+        <w:t xml:space="preserve">#build off previous model, making it a mixed model with additional co variates </w:t>
+      </w:r>
+      <w:r>
+        <w:br/>
+      </w:r>
+      <w:r>
+        <w:rPr>
+          <w:rStyle w:val="NormalTok"/>
+        </w:rPr>
+        <w:t xml:space="preserve">tbmod </w:t>
+      </w:r>
+      <w:r>
+        <w:rPr>
+          <w:rStyle w:val="OtherTok"/>
+        </w:rPr>
+        <w:t xml:space="preserve">&lt;-</w:t>
+      </w:r>
+      <w:r>
+        <w:rPr>
+          <w:rStyle w:val="NormalTok"/>
+        </w:rPr>
+        <w:t xml:space="preserve"> </w:t>
+      </w:r>
+      <w:r>
+        <w:rPr>
+          <w:rStyle w:val="FunctionTok"/>
+        </w:rPr>
+        <w:t xml:space="preserve">lm</w:t>
+      </w:r>
+      <w:r>
+        <w:rPr>
+          <w:rStyle w:val="NormalTok"/>
+        </w:rPr>
+        <w:t xml:space="preserve">(growthrate </w:t>
+      </w:r>
+      <w:r>
+        <w:rPr>
+          <w:rStyle w:val="SpecialCharTok"/>
+        </w:rPr>
+        <w:t xml:space="preserve">~</w:t>
+      </w:r>
+      <w:r>
+        <w:rPr>
+          <w:rStyle w:val="NormalTok"/>
+        </w:rPr>
+        <w:t xml:space="preserve"> littersize</w:t>
+      </w:r>
+      <w:r>
+        <w:rPr>
+          <w:rStyle w:val="SpecialCharTok"/>
+        </w:rPr>
+        <w:t xml:space="preserve">*</w:t>
+      </w:r>
+      <w:r>
+        <w:rPr>
+          <w:rStyle w:val="NormalTok"/>
+        </w:rPr>
+        <w:t xml:space="preserve">density</w:t>
+      </w:r>
+      <w:r>
+        <w:rPr>
+          <w:rStyle w:val="SpecialCharTok"/>
+        </w:rPr>
+        <w:t xml:space="preserve">*</w:t>
+      </w:r>
+      <w:r>
+        <w:rPr>
+          <w:rStyle w:val="NormalTok"/>
+        </w:rPr>
+        <w:t xml:space="preserve">treatment_food, food)</w:t>
+      </w:r>
+      <w:r>
+        <w:br/>
+      </w:r>
+      <w:r>
+        <w:br/>
+      </w:r>
+      <w:r>
+        <w:rPr>
+          <w:rStyle w:val="CommentTok"/>
+        </w:rPr>
+        <w:t xml:space="preserve">#this model is Growth Rate ~ Litter Size x Density x Grid-level Treatment</w:t>
+      </w:r>
+      <w:r>
+        <w:br/>
+      </w:r>
+      <w:r>
+        <w:rPr>
+          <w:rStyle w:val="NormalTok"/>
+        </w:rPr>
+        <w:t xml:space="preserve">mixmod </w:t>
+      </w:r>
+      <w:r>
+        <w:rPr>
+          <w:rStyle w:val="OtherTok"/>
+        </w:rPr>
+        <w:t xml:space="preserve">&lt;-</w:t>
+      </w:r>
+      <w:r>
+        <w:rPr>
+          <w:rStyle w:val="NormalTok"/>
+        </w:rPr>
+        <w:t xml:space="preserve"> </w:t>
+      </w:r>
+      <w:r>
+        <w:rPr>
+          <w:rStyle w:val="FunctionTok"/>
+        </w:rPr>
+        <w:t xml:space="preserve">lmer</w:t>
+      </w:r>
+      <w:r>
+        <w:rPr>
+          <w:rStyle w:val="NormalTok"/>
+        </w:rPr>
+        <w:t xml:space="preserve">(growthrate </w:t>
+      </w:r>
+      <w:r>
+        <w:rPr>
+          <w:rStyle w:val="SpecialCharTok"/>
+        </w:rPr>
+        <w:t xml:space="preserve">~</w:t>
+      </w:r>
+      <w:r>
+        <w:rPr>
+          <w:rStyle w:val="NormalTok"/>
+        </w:rPr>
+        <w:t xml:space="preserve"> </w:t>
+      </w:r>
+      <w:r>
+        <w:br/>
+      </w:r>
+      <w:r>
+        <w:rPr>
+          <w:rStyle w:val="NormalTok"/>
+        </w:rPr>
+        <w:t xml:space="preserve">              littersize</w:t>
+      </w:r>
+      <w:r>
+        <w:rPr>
+          <w:rStyle w:val="SpecialCharTok"/>
+        </w:rPr>
+        <w:t xml:space="preserve">*</w:t>
+      </w:r>
+      <w:r>
+        <w:rPr>
+          <w:rStyle w:val="NormalTok"/>
+        </w:rPr>
+        <w:t xml:space="preserve">density</w:t>
+      </w:r>
+      <w:r>
+        <w:rPr>
+          <w:rStyle w:val="SpecialCharTok"/>
+        </w:rPr>
+        <w:t xml:space="preserve">*</w:t>
+      </w:r>
+      <w:r>
+        <w:rPr>
+          <w:rStyle w:val="NormalTok"/>
+        </w:rPr>
+        <w:t xml:space="preserve">treatment_food </w:t>
+      </w:r>
+      <w:r>
+        <w:rPr>
+          <w:rStyle w:val="SpecialCharTok"/>
+        </w:rPr>
+        <w:t xml:space="preserve">+</w:t>
+      </w:r>
+      <w:r>
+        <w:br/>
+      </w:r>
+      <w:r>
+        <w:rPr>
+          <w:rStyle w:val="NormalTok"/>
+        </w:rPr>
+        <w:t xml:space="preserve">              mother_age </w:t>
+      </w:r>
+      <w:r>
+        <w:rPr>
+          <w:rStyle w:val="SpecialCharTok"/>
+        </w:rPr>
+        <w:t xml:space="preserve">+</w:t>
+      </w:r>
+      <w:r>
+        <w:rPr>
+          <w:rStyle w:val="NormalTok"/>
+        </w:rPr>
+        <w:t xml:space="preserve"> </w:t>
+      </w:r>
+      <w:r>
+        <w:br/>
+      </w:r>
+      <w:r>
+        <w:rPr>
+          <w:rStyle w:val="NormalTok"/>
+        </w:rPr>
+        <w:t xml:space="preserve">              mother_age</w:t>
+      </w:r>
+      <w:r>
+        <w:rPr>
+          <w:rStyle w:val="SpecialCharTok"/>
+        </w:rPr>
+        <w:t xml:space="preserve">^</w:t>
+      </w:r>
+      <w:r>
+        <w:rPr>
+          <w:rStyle w:val="DecValTok"/>
+        </w:rPr>
+        <w:t xml:space="preserve">2</w:t>
+      </w:r>
+      <w:r>
+        <w:rPr>
+          <w:rStyle w:val="NormalTok"/>
+        </w:rPr>
+        <w:t xml:space="preserve"> </w:t>
+      </w:r>
+      <w:r>
+        <w:rPr>
+          <w:rStyle w:val="SpecialCharTok"/>
+        </w:rPr>
+        <w:t xml:space="preserve">+</w:t>
+      </w:r>
+      <w:r>
+        <w:br/>
+      </w:r>
+      <w:r>
+        <w:rPr>
+          <w:rStyle w:val="NormalTok"/>
+        </w:rPr>
+        <w:t xml:space="preserve">              sex </w:t>
+      </w:r>
+      <w:r>
+        <w:rPr>
+          <w:rStyle w:val="SpecialCharTok"/>
+        </w:rPr>
+        <w:t xml:space="preserve">+</w:t>
+      </w:r>
+      <w:r>
+        <w:rPr>
+          <w:rStyle w:val="NormalTok"/>
+        </w:rPr>
+        <w:t xml:space="preserve"> </w:t>
+      </w:r>
+      <w:r>
+        <w:br/>
+      </w:r>
+      <w:r>
+        <w:rPr>
+          <w:rStyle w:val="NormalTok"/>
+        </w:rPr>
+        <w:t xml:space="preserve">              mast </w:t>
+      </w:r>
+      <w:r>
+        <w:rPr>
+          <w:rStyle w:val="SpecialCharTok"/>
+        </w:rPr>
+        <w:t xml:space="preserve">+</w:t>
+      </w:r>
+      <w:r>
+        <w:rPr>
+          <w:rStyle w:val="NormalTok"/>
+        </w:rPr>
+        <w:t xml:space="preserve"> </w:t>
+      </w:r>
+      <w:r>
+        <w:br/>
+      </w:r>
+      <w:r>
+        <w:rPr>
+          <w:rStyle w:val="NormalTok"/>
+        </w:rPr>
+        <w:t xml:space="preserve">              bjulian </w:t>
+      </w:r>
+      <w:r>
+        <w:rPr>
+          <w:rStyle w:val="SpecialCharTok"/>
+        </w:rPr>
+        <w:t xml:space="preserve">+</w:t>
+      </w:r>
+      <w:r>
+        <w:rPr>
+          <w:rStyle w:val="NormalTok"/>
+        </w:rPr>
+        <w:t xml:space="preserve"> </w:t>
+      </w:r>
+      <w:r>
+        <w:br/>
+      </w:r>
+      <w:r>
+        <w:rPr>
+          <w:rStyle w:val="NormalTok"/>
+        </w:rPr>
+        <w:t xml:space="preserve">              (</w:t>
+      </w:r>
+      <w:r>
+        <w:rPr>
+          <w:rStyle w:val="DecValTok"/>
+        </w:rPr>
+        <w:t xml:space="preserve">1</w:t>
+      </w:r>
+      <w:r>
+        <w:rPr>
+          <w:rStyle w:val="SpecialCharTok"/>
+        </w:rPr>
+        <w:t xml:space="preserve">|</w:t>
+      </w:r>
+      <w:r>
+        <w:rPr>
+          <w:rStyle w:val="NormalTok"/>
+        </w:rPr>
+        <w:t xml:space="preserve">mother_id</w:t>
+      </w:r>
+      <w:r>
+        <w:rPr>
+          <w:rStyle w:val="SpecialCharTok"/>
+        </w:rPr>
+        <w:t xml:space="preserve">/</w:t>
+      </w:r>
+      <w:r>
+        <w:rPr>
+          <w:rStyle w:val="NormalTok"/>
+        </w:rPr>
+        <w:t xml:space="preserve">litter_id) </w:t>
+      </w:r>
+      <w:r>
+        <w:rPr>
+          <w:rStyle w:val="SpecialCharTok"/>
+        </w:rPr>
+        <w:t xml:space="preserve">+</w:t>
+      </w:r>
+      <w:r>
+        <w:br/>
+      </w:r>
+      <w:r>
+        <w:rPr>
+          <w:rStyle w:val="NormalTok"/>
+        </w:rPr>
+        <w:t xml:space="preserve">              (</w:t>
+      </w:r>
+      <w:r>
+        <w:rPr>
+          <w:rStyle w:val="DecValTok"/>
+        </w:rPr>
+        <w:t xml:space="preserve">1</w:t>
+      </w:r>
+      <w:r>
+        <w:rPr>
+          <w:rStyle w:val="SpecialCharTok"/>
+        </w:rPr>
+        <w:t xml:space="preserve">|</w:t>
+      </w:r>
+      <w:r>
+        <w:rPr>
+          <w:rStyle w:val="NormalTok"/>
+        </w:rPr>
+        <w:t xml:space="preserve">year), </w:t>
+      </w:r>
+      <w:r>
+        <w:br/>
+      </w:r>
+      <w:r>
+        <w:rPr>
+          <w:rStyle w:val="NormalTok"/>
+        </w:rPr>
+        <w:t xml:space="preserve">            food)</w:t>
+      </w:r>
+      <w:r>
+        <w:br/>
+      </w:r>
+      <w:r>
+        <w:br/>
+      </w:r>
+      <w:r>
+        <w:rPr>
+          <w:rStyle w:val="CommentTok"/>
+        </w:rPr>
+        <w:t xml:space="preserve">#summaries</w:t>
+      </w:r>
+      <w:r>
+        <w:br/>
+      </w:r>
+      <w:r>
+        <w:rPr>
+          <w:rStyle w:val="FunctionTok"/>
+        </w:rPr>
+        <w:t xml:space="preserve">anova</w:t>
+      </w:r>
+      <w:r>
+        <w:rPr>
+          <w:rStyle w:val="NormalTok"/>
+        </w:rPr>
+        <w:t xml:space="preserve">(mixmod)</w:t>
+      </w:r>
+    </w:p>
+    <w:p>
+      <w:pPr>
+        <w:pStyle w:val="SourceCode"/>
+      </w:pPr>
+      <w:r>
+        <w:rPr>
+          <w:rStyle w:val="VerbatimChar"/>
+        </w:rPr>
+        <w:t xml:space="preserve">## Analysis of Variance Table</w:t>
+      </w:r>
+      <w:r>
+        <w:br/>
+      </w:r>
+      <w:r>
+        <w:rPr>
+          <w:rStyle w:val="VerbatimChar"/>
+        </w:rPr>
+        <w:t xml:space="preserve">##                                   npar Sum Sq Mean Sq  F value</w:t>
+      </w:r>
+      <w:r>
+        <w:br/>
+      </w:r>
+      <w:r>
+        <w:rPr>
+          <w:rStyle w:val="VerbatimChar"/>
+        </w:rPr>
+        <w:t xml:space="preserve">## littersize                           1 4.2101  4.2101 127.4264</w:t>
+      </w:r>
+      <w:r>
+        <w:br/>
+      </w:r>
+      <w:r>
+        <w:rPr>
+          <w:rStyle w:val="VerbatimChar"/>
+        </w:rPr>
+        <w:t xml:space="preserve">## density                              1 0.0769  0.0769   2.3269</w:t>
+      </w:r>
+      <w:r>
+        <w:br/>
+      </w:r>
+      <w:r>
+        <w:rPr>
+          <w:rStyle w:val="VerbatimChar"/>
+        </w:rPr>
+        <w:t xml:space="preserve">## treatment_food                       2 0.6441  0.3220   9.7468</w:t>
+      </w:r>
+      <w:r>
+        <w:br/>
+      </w:r>
+      <w:r>
+        <w:rPr>
+          <w:rStyle w:val="VerbatimChar"/>
+        </w:rPr>
+        <w:t xml:space="preserve">## mother_age                           1 0.0189  0.0189   0.5706</w:t>
+      </w:r>
+      <w:r>
+        <w:br/>
+      </w:r>
+      <w:r>
+        <w:rPr>
+          <w:rStyle w:val="VerbatimChar"/>
+        </w:rPr>
+        <w:t xml:space="preserve">## sex                                  1 0.8029  0.8029  24.3000</w:t>
+      </w:r>
+      <w:r>
+        <w:br/>
+      </w:r>
+      <w:r>
+        <w:rPr>
+          <w:rStyle w:val="VerbatimChar"/>
+        </w:rPr>
+        <w:t xml:space="preserve">## mast                                 1 0.0161  0.0161   0.4859</w:t>
+      </w:r>
+      <w:r>
+        <w:br/>
+      </w:r>
+      <w:r>
+        <w:rPr>
+          <w:rStyle w:val="VerbatimChar"/>
+        </w:rPr>
+        <w:t xml:space="preserve">## bjulian                              1 2.4690  2.4690  74.7285</w:t>
+      </w:r>
+      <w:r>
+        <w:br/>
+      </w:r>
+      <w:r>
+        <w:rPr>
+          <w:rStyle w:val="VerbatimChar"/>
+        </w:rPr>
+        <w:t xml:space="preserve">## littersize:density                   1 0.0569  0.0569   1.7227</w:t>
+      </w:r>
+      <w:r>
+        <w:br/>
+      </w:r>
+      <w:r>
+        <w:rPr>
+          <w:rStyle w:val="VerbatimChar"/>
+        </w:rPr>
+        <w:t xml:space="preserve">## littersize:treatment_food            2 0.2057  0.1028   3.1123</w:t>
+      </w:r>
+      <w:r>
+        <w:br/>
+      </w:r>
+      <w:r>
+        <w:rPr>
+          <w:rStyle w:val="VerbatimChar"/>
+        </w:rPr>
+        <w:t xml:space="preserve">## density:treatment_food               2 0.0727  0.0363   1.0996</w:t>
+      </w:r>
+      <w:r>
+        <w:br/>
+      </w:r>
+      <w:r>
+        <w:rPr>
+          <w:rStyle w:val="VerbatimChar"/>
+        </w:rPr>
+        <w:t xml:space="preserve">## littersize:density:treatment_food    2 0.1268  0.0634   1.9182</w:t>
+      </w:r>
+    </w:p>
+    <w:p>
+      <w:pPr>
+        <w:pStyle w:val="SourceCode"/>
+      </w:pPr>
+      <w:r>
+        <w:rPr>
+          <w:rStyle w:val="CommentTok"/>
+        </w:rPr>
+        <w:t xml:space="preserve">#get effects table for model</w:t>
+      </w:r>
+      <w:r>
+        <w:br/>
+      </w:r>
+      <w:r>
+        <w:rPr>
+          <w:rStyle w:val="NormalTok"/>
+        </w:rPr>
+        <w:t xml:space="preserve">mix_effs </w:t>
+      </w:r>
+      <w:r>
+        <w:rPr>
+          <w:rStyle w:val="OtherTok"/>
+        </w:rPr>
+        <w:t xml:space="preserve">&lt;-</w:t>
+      </w:r>
+      <w:r>
+        <w:rPr>
+          <w:rStyle w:val="NormalTok"/>
+        </w:rPr>
+        <w:t xml:space="preserve"> </w:t>
+      </w:r>
+      <w:r>
+        <w:rPr>
+          <w:rStyle w:val="FunctionTok"/>
+        </w:rPr>
+        <w:t xml:space="preserve">as.data.table</w:t>
+      </w:r>
+      <w:r>
+        <w:rPr>
+          <w:rStyle w:val="NormalTok"/>
+        </w:rPr>
+        <w:t xml:space="preserve">(</w:t>
+      </w:r>
+      <w:r>
+        <w:rPr>
+          <w:rStyle w:val="FunctionTok"/>
+        </w:rPr>
+        <w:t xml:space="preserve">ggpredict</w:t>
+      </w:r>
+      <w:r>
+        <w:rPr>
+          <w:rStyle w:val="NormalTok"/>
+        </w:rPr>
+        <w:t xml:space="preserve">(mixmod, </w:t>
+      </w:r>
+      <w:r>
+        <w:rPr>
+          <w:rStyle w:val="AttributeTok"/>
+        </w:rPr>
+        <w:t xml:space="preserve">terms =</w:t>
+      </w:r>
+      <w:r>
+        <w:rPr>
+          <w:rStyle w:val="NormalTok"/>
+        </w:rPr>
+        <w:t xml:space="preserve"> </w:t>
+      </w:r>
+      <w:r>
+        <w:rPr>
+          <w:rStyle w:val="FunctionTok"/>
+        </w:rPr>
+        <w:t xml:space="preserve">c</w:t>
+      </w:r>
+      <w:r>
+        <w:rPr>
+          <w:rStyle w:val="NormalTok"/>
+        </w:rPr>
+        <w:t xml:space="preserve">(</w:t>
+      </w:r>
+      <w:r>
+        <w:rPr>
+          <w:rStyle w:val="StringTok"/>
+        </w:rPr>
+        <w:t xml:space="preserve">"littersize"</w:t>
+      </w:r>
+      <w:r>
+        <w:rPr>
+          <w:rStyle w:val="NormalTok"/>
+        </w:rPr>
+        <w:t xml:space="preserve">, </w:t>
+      </w:r>
+      <w:r>
+        <w:rPr>
+          <w:rStyle w:val="StringTok"/>
+        </w:rPr>
+        <w:t xml:space="preserve">"density"</w:t>
+      </w:r>
+      <w:r>
+        <w:rPr>
+          <w:rStyle w:val="NormalTok"/>
+        </w:rPr>
+        <w:t xml:space="preserve">, </w:t>
+      </w:r>
+      <w:r>
+        <w:rPr>
+          <w:rStyle w:val="StringTok"/>
+        </w:rPr>
+        <w:t xml:space="preserve">"treatment_food"</w:t>
+      </w:r>
+      <w:r>
+        <w:rPr>
+          <w:rStyle w:val="NormalTok"/>
+        </w:rPr>
+        <w:t xml:space="preserve">)))</w:t>
+      </w:r>
+      <w:r>
+        <w:br/>
+      </w:r>
+      <w:r>
+        <w:br/>
+      </w:r>
+      <w:r>
+        <w:rPr>
+          <w:rStyle w:val="FunctionTok"/>
+        </w:rPr>
+        <w:t xml:space="preserve">ggplot</w:t>
+      </w:r>
+      <w:r>
+        <w:rPr>
+          <w:rStyle w:val="NormalTok"/>
+        </w:rPr>
+        <w:t xml:space="preserve">(mix_effs)</w:t>
+      </w:r>
+      <w:r>
+        <w:rPr>
+          <w:rStyle w:val="SpecialCharTok"/>
+        </w:rPr>
+        <w:t xml:space="preserve">+</w:t>
+      </w:r>
+      <w:r>
+        <w:br/>
+      </w:r>
+      <w:r>
+        <w:rPr>
+          <w:rStyle w:val="NormalTok"/>
+        </w:rPr>
+        <w:t xml:space="preserve">  </w:t>
+      </w:r>
+      <w:r>
+        <w:rPr>
+          <w:rStyle w:val="FunctionTok"/>
+        </w:rPr>
+        <w:t xml:space="preserve">geom_ribbon</w:t>
+      </w:r>
+      <w:r>
+        <w:rPr>
+          <w:rStyle w:val="NormalTok"/>
+        </w:rPr>
+        <w:t xml:space="preserve">(</w:t>
+      </w:r>
+      <w:r>
+        <w:rPr>
+          <w:rStyle w:val="FunctionTok"/>
+        </w:rPr>
+        <w:t xml:space="preserve">aes</w:t>
+      </w:r>
+      <w:r>
+        <w:rPr>
+          <w:rStyle w:val="NormalTok"/>
+        </w:rPr>
+        <w:t xml:space="preserve">(</w:t>
+      </w:r>
+      <w:r>
+        <w:rPr>
+          <w:rStyle w:val="AttributeTok"/>
+        </w:rPr>
+        <w:t xml:space="preserve">x =</w:t>
+      </w:r>
+      <w:r>
+        <w:rPr>
+          <w:rStyle w:val="NormalTok"/>
+        </w:rPr>
+        <w:t xml:space="preserve"> x, </w:t>
+      </w:r>
+      <w:r>
+        <w:rPr>
+          <w:rStyle w:val="AttributeTok"/>
+        </w:rPr>
+        <w:t xml:space="preserve">ymin =</w:t>
+      </w:r>
+      <w:r>
+        <w:rPr>
+          <w:rStyle w:val="NormalTok"/>
+        </w:rPr>
+        <w:t xml:space="preserve"> conf.low, </w:t>
+      </w:r>
+      <w:r>
+        <w:rPr>
+          <w:rStyle w:val="AttributeTok"/>
+        </w:rPr>
+        <w:t xml:space="preserve">ymax =</w:t>
+      </w:r>
+      <w:r>
+        <w:rPr>
+          <w:rStyle w:val="NormalTok"/>
+        </w:rPr>
+        <w:t xml:space="preserve"> conf.high, </w:t>
+      </w:r>
+      <w:r>
+        <w:rPr>
+          <w:rStyle w:val="AttributeTok"/>
+        </w:rPr>
+        <w:t xml:space="preserve">group =</w:t>
+      </w:r>
+      <w:r>
+        <w:rPr>
+          <w:rStyle w:val="NormalTok"/>
+        </w:rPr>
+        <w:t xml:space="preserve"> group, </w:t>
+      </w:r>
+      <w:r>
+        <w:rPr>
+          <w:rStyle w:val="AttributeTok"/>
+        </w:rPr>
+        <w:t xml:space="preserve">fill =</w:t>
+      </w:r>
+      <w:r>
+        <w:rPr>
+          <w:rStyle w:val="NormalTok"/>
+        </w:rPr>
+        <w:t xml:space="preserve"> group), </w:t>
+      </w:r>
+      <w:r>
+        <w:rPr>
+          <w:rStyle w:val="AttributeTok"/>
+        </w:rPr>
+        <w:t xml:space="preserve">alpha =</w:t>
+      </w:r>
+      <w:r>
+        <w:rPr>
+          <w:rStyle w:val="NormalTok"/>
+        </w:rPr>
+        <w:t xml:space="preserve"> </w:t>
+      </w:r>
+      <w:r>
+        <w:rPr>
+          <w:rStyle w:val="FloatTok"/>
+        </w:rPr>
+        <w:t xml:space="preserve">0.2</w:t>
+      </w:r>
+      <w:r>
+        <w:rPr>
+          <w:rStyle w:val="NormalTok"/>
+        </w:rPr>
+        <w:t xml:space="preserve">)</w:t>
+      </w:r>
+      <w:r>
+        <w:rPr>
+          <w:rStyle w:val="SpecialCharTok"/>
+        </w:rPr>
+        <w:t xml:space="preserve">+</w:t>
+      </w:r>
+      <w:r>
+        <w:br/>
+      </w:r>
+      <w:r>
+        <w:rPr>
+          <w:rStyle w:val="NormalTok"/>
+        </w:rPr>
+        <w:t xml:space="preserve">  </w:t>
+      </w:r>
+      <w:r>
+        <w:rPr>
+          <w:rStyle w:val="FunctionTok"/>
+        </w:rPr>
+        <w:t xml:space="preserve">geom_line</w:t>
+      </w:r>
+      <w:r>
+        <w:rPr>
+          <w:rStyle w:val="NormalTok"/>
+        </w:rPr>
+        <w:t xml:space="preserve">(</w:t>
+      </w:r>
+      <w:r>
+        <w:rPr>
+          <w:rStyle w:val="FunctionTok"/>
+        </w:rPr>
+        <w:t xml:space="preserve">aes</w:t>
+      </w:r>
+      <w:r>
+        <w:rPr>
+          <w:rStyle w:val="NormalTok"/>
+        </w:rPr>
+        <w:t xml:space="preserve">(</w:t>
+      </w:r>
+      <w:r>
+        <w:rPr>
+          <w:rStyle w:val="AttributeTok"/>
+        </w:rPr>
+        <w:t xml:space="preserve">y =</w:t>
+      </w:r>
+      <w:r>
+        <w:rPr>
+          <w:rStyle w:val="NormalTok"/>
+        </w:rPr>
+        <w:t xml:space="preserve"> predicted, </w:t>
+      </w:r>
+      <w:r>
+        <w:rPr>
+          <w:rStyle w:val="AttributeTok"/>
+        </w:rPr>
+        <w:t xml:space="preserve">x =</w:t>
+      </w:r>
+      <w:r>
+        <w:rPr>
+          <w:rStyle w:val="NormalTok"/>
+        </w:rPr>
+        <w:t xml:space="preserve"> x, </w:t>
+      </w:r>
+      <w:r>
+        <w:rPr>
+          <w:rStyle w:val="AttributeTok"/>
+        </w:rPr>
+        <w:t xml:space="preserve">color =</w:t>
+      </w:r>
+      <w:r>
+        <w:rPr>
+          <w:rStyle w:val="NormalTok"/>
+        </w:rPr>
+        <w:t xml:space="preserve"> group, </w:t>
+      </w:r>
+      <w:r>
+        <w:rPr>
+          <w:rStyle w:val="AttributeTok"/>
+        </w:rPr>
+        <w:t xml:space="preserve">group =</w:t>
+      </w:r>
+      <w:r>
+        <w:rPr>
+          <w:rStyle w:val="NormalTok"/>
+        </w:rPr>
+        <w:t xml:space="preserve"> group), </w:t>
+      </w:r>
+      <w:r>
+        <w:rPr>
+          <w:rStyle w:val="AttributeTok"/>
+        </w:rPr>
+        <w:t xml:space="preserve">linewidth =</w:t>
+      </w:r>
+      <w:r>
+        <w:rPr>
+          <w:rStyle w:val="NormalTok"/>
+        </w:rPr>
+        <w:t xml:space="preserve"> </w:t>
+      </w:r>
+      <w:r>
+        <w:rPr>
+          <w:rStyle w:val="DecValTok"/>
+        </w:rPr>
+        <w:t xml:space="preserve">1</w:t>
+      </w:r>
+      <w:r>
+        <w:rPr>
+          <w:rStyle w:val="NormalTok"/>
+        </w:rPr>
+        <w:t xml:space="preserve">)</w:t>
+      </w:r>
+      <w:r>
+        <w:rPr>
+          <w:rStyle w:val="SpecialCharTok"/>
+        </w:rPr>
+        <w:t xml:space="preserve">+</w:t>
+      </w:r>
+      <w:r>
+        <w:br/>
+      </w:r>
+      <w:r>
+        <w:rPr>
+          <w:rStyle w:val="NormalTok"/>
+        </w:rPr>
+        <w:t xml:space="preserve">  </w:t>
+      </w:r>
+      <w:r>
+        <w:rPr>
+          <w:rStyle w:val="FunctionTok"/>
+        </w:rPr>
+        <w:t xml:space="preserve">scale_color_discrete</w:t>
+      </w:r>
+      <w:r>
+        <w:rPr>
+          <w:rStyle w:val="NormalTok"/>
+        </w:rPr>
+        <w:t xml:space="preserve">(</w:t>
+      </w:r>
+      <w:r>
+        <w:rPr>
+          <w:rStyle w:val="AttributeTok"/>
+        </w:rPr>
+        <w:t xml:space="preserve">name =</w:t>
+      </w:r>
+      <w:r>
+        <w:rPr>
+          <w:rStyle w:val="NormalTok"/>
+        </w:rPr>
+        <w:t xml:space="preserve"> </w:t>
+      </w:r>
+      <w:r>
+        <w:rPr>
+          <w:rStyle w:val="StringTok"/>
+        </w:rPr>
+        <w:t xml:space="preserve">"Density (ind/ha)"</w:t>
+      </w:r>
+      <w:r>
+        <w:rPr>
+          <w:rStyle w:val="NormalTok"/>
+        </w:rPr>
+        <w:t xml:space="preserve">)</w:t>
+      </w:r>
+      <w:r>
+        <w:rPr>
+          <w:rStyle w:val="SpecialCharTok"/>
+        </w:rPr>
+        <w:t xml:space="preserve">+</w:t>
+      </w:r>
+      <w:r>
+        <w:br/>
+      </w:r>
+      <w:r>
+        <w:rPr>
+          <w:rStyle w:val="NormalTok"/>
+        </w:rPr>
+        <w:t xml:space="preserve">  </w:t>
+      </w:r>
+      <w:r>
+        <w:rPr>
+          <w:rStyle w:val="FunctionTok"/>
+        </w:rPr>
+        <w:t xml:space="preserve">scale_fill_discrete</w:t>
+      </w:r>
+      <w:r>
+        <w:rPr>
+          <w:rStyle w:val="NormalTok"/>
+        </w:rPr>
+        <w:t xml:space="preserve">(</w:t>
+      </w:r>
+      <w:r>
+        <w:rPr>
+          <w:rStyle w:val="AttributeTok"/>
+        </w:rPr>
+        <w:t xml:space="preserve">name =</w:t>
+      </w:r>
+      <w:r>
+        <w:rPr>
+          <w:rStyle w:val="NormalTok"/>
+        </w:rPr>
+        <w:t xml:space="preserve"> </w:t>
+      </w:r>
+      <w:r>
+        <w:rPr>
+          <w:rStyle w:val="StringTok"/>
+        </w:rPr>
+        <w:t xml:space="preserve">"Density (ind/ha)"</w:t>
+      </w:r>
+      <w:r>
+        <w:rPr>
+          <w:rStyle w:val="NormalTok"/>
+        </w:rPr>
+        <w:t xml:space="preserve">)</w:t>
+      </w:r>
+      <w:r>
+        <w:rPr>
+          <w:rStyle w:val="SpecialCharTok"/>
+        </w:rPr>
+        <w:t xml:space="preserve">+</w:t>
+      </w:r>
+      <w:r>
+        <w:br/>
+      </w:r>
+      <w:r>
+        <w:rPr>
+          <w:rStyle w:val="NormalTok"/>
+        </w:rPr>
+        <w:t xml:space="preserve">  </w:t>
+      </w:r>
+      <w:r>
+        <w:rPr>
+          <w:rStyle w:val="FunctionTok"/>
+        </w:rPr>
+        <w:t xml:space="preserve">labs</w:t>
+      </w:r>
+      <w:r>
+        <w:rPr>
+          <w:rStyle w:val="NormalTok"/>
+        </w:rPr>
+        <w:t xml:space="preserve">(</w:t>
+      </w:r>
+      <w:r>
+        <w:rPr>
+          <w:rStyle w:val="AttributeTok"/>
+        </w:rPr>
+        <w:t xml:space="preserve">x =</w:t>
+      </w:r>
+      <w:r>
+        <w:rPr>
+          <w:rStyle w:val="NormalTok"/>
+        </w:rPr>
+        <w:t xml:space="preserve"> </w:t>
+      </w:r>
+      <w:r>
+        <w:rPr>
+          <w:rStyle w:val="StringTok"/>
+        </w:rPr>
+        <w:t xml:space="preserve">"Litter size"</w:t>
+      </w:r>
+      <w:r>
+        <w:rPr>
+          <w:rStyle w:val="NormalTok"/>
+        </w:rPr>
+        <w:t xml:space="preserve">, </w:t>
+      </w:r>
+      <w:r>
+        <w:rPr>
+          <w:rStyle w:val="AttributeTok"/>
+        </w:rPr>
+        <w:t xml:space="preserve">y =</w:t>
+      </w:r>
+      <w:r>
+        <w:rPr>
+          <w:rStyle w:val="NormalTok"/>
+        </w:rPr>
+        <w:t xml:space="preserve"> </w:t>
+      </w:r>
+      <w:r>
+        <w:rPr>
+          <w:rStyle w:val="StringTok"/>
+        </w:rPr>
+        <w:t xml:space="preserve">"Growth rate (g/day)"</w:t>
+      </w:r>
+      <w:r>
+        <w:rPr>
+          <w:rStyle w:val="NormalTok"/>
+        </w:rPr>
+        <w:t xml:space="preserve">, </w:t>
+      </w:r>
+      <w:r>
+        <w:rPr>
+          <w:rStyle w:val="AttributeTok"/>
+        </w:rPr>
+        <w:t xml:space="preserve">subtitle =</w:t>
+      </w:r>
+      <w:r>
+        <w:rPr>
+          <w:rStyle w:val="NormalTok"/>
+        </w:rPr>
+        <w:t xml:space="preserve"> </w:t>
+      </w:r>
+      <w:r>
+        <w:rPr>
+          <w:rStyle w:val="StringTok"/>
+        </w:rPr>
+        <w:t xml:space="preserve">"Grid Treatment + Bucket"</w:t>
+      </w:r>
+      <w:r>
+        <w:rPr>
+          <w:rStyle w:val="NormalTok"/>
+        </w:rPr>
+        <w:t xml:space="preserve">)</w:t>
+      </w:r>
+      <w:r>
+        <w:rPr>
+          <w:rStyle w:val="SpecialCharTok"/>
+        </w:rPr>
+        <w:t xml:space="preserve">+</w:t>
+      </w:r>
+      <w:r>
+        <w:br/>
+      </w:r>
+      <w:r>
+        <w:rPr>
+          <w:rStyle w:val="NormalTok"/>
+        </w:rPr>
+        <w:t xml:space="preserve">  </w:t>
+      </w:r>
+      <w:r>
+        <w:rPr>
+          <w:rStyle w:val="FunctionTok"/>
+        </w:rPr>
+        <w:t xml:space="preserve">facet_wrap</w:t>
+      </w:r>
+      <w:r>
+        <w:rPr>
+          <w:rStyle w:val="NormalTok"/>
+        </w:rPr>
+        <w:t xml:space="preserve">(</w:t>
+      </w:r>
+      <w:r>
+        <w:rPr>
+          <w:rStyle w:val="SpecialCharTok"/>
+        </w:rPr>
+        <w:t xml:space="preserve">~</w:t>
+      </w:r>
+      <w:r>
+        <w:rPr>
+          <w:rStyle w:val="NormalTok"/>
+        </w:rPr>
+        <w:t xml:space="preserve">facet)</w:t>
+      </w:r>
+      <w:r>
+        <w:rPr>
+          <w:rStyle w:val="SpecialCharTok"/>
+        </w:rPr>
+        <w:t xml:space="preserve">+</w:t>
+      </w:r>
+      <w:r>
+        <w:br/>
+      </w:r>
+      <w:r>
+        <w:rPr>
+          <w:rStyle w:val="NormalTok"/>
+        </w:rPr>
+        <w:t xml:space="preserve">  </w:t>
+      </w:r>
+      <w:r>
+        <w:rPr>
+          <w:rStyle w:val="FunctionTok"/>
+        </w:rPr>
+        <w:t xml:space="preserve">theme_bw</w:t>
+      </w:r>
+      <w:r>
+        <w:rPr>
+          <w:rStyle w:val="NormalTok"/>
+        </w:rPr>
+        <w:t xml:space="preserve">()</w:t>
+      </w:r>
+    </w:p>
+    <w:p>
+      <w:pPr>
+        <w:pStyle w:val="FirstParagraph"/>
+      </w:pPr>
+      <w:r>
+        <w:drawing>
+          <wp:inline>
+            <wp:extent cx="4620126" cy="3696101"/>
+            <wp:effectExtent b="0" l="0" r="0" t="0"/>
+            <wp:docPr descr="" title="" id="19" name="Picture"/>
+            <a:graphic>
+              <a:graphicData uri="http://schemas.openxmlformats.org/drawingml/2006/picture">
+                <pic:pic>
+                  <pic:nvPicPr>
+                    <pic:cNvPr descr="Preliminary_results_files/Preliminary_results_files/figure-docx/fig 4-1.png" id="20" name="Picture"/>
+                    <pic:cNvPicPr>
+                      <a:picLocks noChangeArrowheads="1" noChangeAspect="1"/>
+                    </pic:cNvPicPr>
+                  </pic:nvPicPr>
+                  <pic:blipFill>
+                    <a:blip r:embed="rId18"/>
+                    <a:stretch>
+                      <a:fillRect/>
+                    </a:stretch>
+                  </pic:blipFill>
+                  <pic:spPr bwMode="auto">
+                    <a:xfrm>
+                      <a:off x="0" y="0"/>
+                      <a:ext cx="4620126" cy="3696101"/>
+                    </a:xfrm>
+                    <a:prstGeom prst="rect">
+                      <a:avLst/>
+                    </a:prstGeom>
+                    <a:noFill/>
+                    <a:ln w="9525">
+                      <a:noFill/>
+                      <a:headEnd/>
+                      <a:tailEnd/>
+                    </a:ln>
+                  </pic:spPr>
+                </pic:pic>
+              </a:graphicData>
+            </a:graphic>
+          </wp:inline>
+        </w:drawing>
+      </w:r>
+    </w:p>
+    <w:bookmarkEnd w:id="21"/>
     <w:sectPr>
       <w:footnotePr>
         <w:numRestart w:val="eachSect"/>

</xml_diff>

<commit_message>
change subset process and move advanced models
</commit_message>
<xml_diff>
--- a/Preliminary_results.docx
+++ b/Preliminary_results.docx
@@ -26,7 +26,7 @@
         <w:t xml:space="preserve">2026-06-02</w:t>
       </w:r>
     </w:p>
-    <w:bookmarkStart w:id="21" w:name="preliminary-analysis"/>
+    <w:bookmarkStart w:id="18" w:name="preliminary-analysis"/>
     <w:p>
       <w:pPr>
         <w:pStyle w:val="Heading2"/>
@@ -169,7 +169,7 @@
         <w:rPr>
           <w:rStyle w:val="VerbatimChar"/>
         </w:rPr>
-        <w:t xml:space="preserve">##                      Df Sum Sq Mean Sq  F value Pr(&gt;F)    </w:t>
+        <w:t xml:space="preserve">##                      Df Sum Sq Mean Sq F value    Pr(&gt;F)    </w:t>
       </w:r>
       <w:r>
         <w:br/>
@@ -178,7 +178,7 @@
         <w:rPr>
           <w:rStyle w:val="VerbatimChar"/>
         </w:rPr>
-        <w:t xml:space="preserve">## littersize            1  50.33  50.327 256.3765 &lt;2e-16 ***</w:t>
+        <w:t xml:space="preserve">## littersize            1  48.46  48.457 251.487 &lt; 2.2e-16 ***</w:t>
       </w:r>
       <w:r>
         <w:br/>
@@ -187,7 +187,7 @@
         <w:rPr>
           <w:rStyle w:val="VerbatimChar"/>
         </w:rPr>
-        <w:t xml:space="preserve">## density               1  13.88  13.878  70.6950 &lt;2e-16 ***</w:t>
+        <w:t xml:space="preserve">## density               1  12.01  12.006  62.311 3.965e-15 ***</w:t>
       </w:r>
       <w:r>
         <w:br/>
@@ -196,7 +196,7 @@
         <w:rPr>
           <w:rStyle w:val="VerbatimChar"/>
         </w:rPr>
-        <w:t xml:space="preserve">## littersize:density    1   0.00   0.004   0.0187 0.8911    </w:t>
+        <w:t xml:space="preserve">## littersize:density    1   0.02   0.017   0.090    0.7642    </w:t>
       </w:r>
       <w:r>
         <w:br/>
@@ -205,7 +205,7 @@
         <w:rPr>
           <w:rStyle w:val="VerbatimChar"/>
         </w:rPr>
-        <w:t xml:space="preserve">## Residuals          3436 674.49   0.196                    </w:t>
+        <w:t xml:space="preserve">## Residuals          3283 632.58   0.193                      </w:t>
       </w:r>
       <w:r>
         <w:br/>
@@ -1819,6 +1819,15 @@
         <w:rPr>
           <w:rStyle w:val="CommentTok"/>
         </w:rPr>
+        <w:t xml:space="preserve"># look at treatment for just food add grids, incorporating bucket</w:t>
+      </w:r>
+      <w:r>
+        <w:br/>
+      </w:r>
+      <w:r>
+        <w:rPr>
+          <w:rStyle w:val="CommentTok"/>
+        </w:rPr>
         <w:t xml:space="preserve">#make model for growth ~ litter size * food add</w:t>
       </w:r>
       <w:r>
@@ -2765,1209 +2774,7 @@
         </w:drawing>
       </w:r>
     </w:p>
-    <w:p>
-      <w:pPr>
-        <w:pStyle w:val="SourceCode"/>
-      </w:pPr>
-      <w:r>
-        <w:rPr>
-          <w:rStyle w:val="CommentTok"/>
-        </w:rPr>
-        <w:t xml:space="preserve">#build off previous model, making it a mixed model with additional co variates </w:t>
-      </w:r>
-      <w:r>
-        <w:br/>
-      </w:r>
-      <w:r>
-        <w:rPr>
-          <w:rStyle w:val="NormalTok"/>
-        </w:rPr>
-        <w:t xml:space="preserve">tbmod </w:t>
-      </w:r>
-      <w:r>
-        <w:rPr>
-          <w:rStyle w:val="OtherTok"/>
-        </w:rPr>
-        <w:t xml:space="preserve">&lt;-</w:t>
-      </w:r>
-      <w:r>
-        <w:rPr>
-          <w:rStyle w:val="NormalTok"/>
-        </w:rPr>
-        <w:t xml:space="preserve"> </w:t>
-      </w:r>
-      <w:r>
-        <w:rPr>
-          <w:rStyle w:val="FunctionTok"/>
-        </w:rPr>
-        <w:t xml:space="preserve">lm</w:t>
-      </w:r>
-      <w:r>
-        <w:rPr>
-          <w:rStyle w:val="NormalTok"/>
-        </w:rPr>
-        <w:t xml:space="preserve">(growthrate </w:t>
-      </w:r>
-      <w:r>
-        <w:rPr>
-          <w:rStyle w:val="SpecialCharTok"/>
-        </w:rPr>
-        <w:t xml:space="preserve">~</w:t>
-      </w:r>
-      <w:r>
-        <w:rPr>
-          <w:rStyle w:val="NormalTok"/>
-        </w:rPr>
-        <w:t xml:space="preserve"> littersize</w:t>
-      </w:r>
-      <w:r>
-        <w:rPr>
-          <w:rStyle w:val="SpecialCharTok"/>
-        </w:rPr>
-        <w:t xml:space="preserve">*</w:t>
-      </w:r>
-      <w:r>
-        <w:rPr>
-          <w:rStyle w:val="NormalTok"/>
-        </w:rPr>
-        <w:t xml:space="preserve">density</w:t>
-      </w:r>
-      <w:r>
-        <w:rPr>
-          <w:rStyle w:val="SpecialCharTok"/>
-        </w:rPr>
-        <w:t xml:space="preserve">*</w:t>
-      </w:r>
-      <w:r>
-        <w:rPr>
-          <w:rStyle w:val="NormalTok"/>
-        </w:rPr>
-        <w:t xml:space="preserve">treatment_food, food)</w:t>
-      </w:r>
-      <w:r>
-        <w:br/>
-      </w:r>
-      <w:r>
-        <w:br/>
-      </w:r>
-      <w:r>
-        <w:rPr>
-          <w:rStyle w:val="CommentTok"/>
-        </w:rPr>
-        <w:t xml:space="preserve">#this model is Growth Rate ~ Litter Size x Density x Grid-level Treatment</w:t>
-      </w:r>
-      <w:r>
-        <w:br/>
-      </w:r>
-      <w:r>
-        <w:rPr>
-          <w:rStyle w:val="NormalTok"/>
-        </w:rPr>
-        <w:t xml:space="preserve">mixmod </w:t>
-      </w:r>
-      <w:r>
-        <w:rPr>
-          <w:rStyle w:val="OtherTok"/>
-        </w:rPr>
-        <w:t xml:space="preserve">&lt;-</w:t>
-      </w:r>
-      <w:r>
-        <w:rPr>
-          <w:rStyle w:val="NormalTok"/>
-        </w:rPr>
-        <w:t xml:space="preserve"> </w:t>
-      </w:r>
-      <w:r>
-        <w:rPr>
-          <w:rStyle w:val="FunctionTok"/>
-        </w:rPr>
-        <w:t xml:space="preserve">lmer</w:t>
-      </w:r>
-      <w:r>
-        <w:rPr>
-          <w:rStyle w:val="NormalTok"/>
-        </w:rPr>
-        <w:t xml:space="preserve">(growthrate </w:t>
-      </w:r>
-      <w:r>
-        <w:rPr>
-          <w:rStyle w:val="SpecialCharTok"/>
-        </w:rPr>
-        <w:t xml:space="preserve">~</w:t>
-      </w:r>
-      <w:r>
-        <w:rPr>
-          <w:rStyle w:val="NormalTok"/>
-        </w:rPr>
-        <w:t xml:space="preserve"> </w:t>
-      </w:r>
-      <w:r>
-        <w:br/>
-      </w:r>
-      <w:r>
-        <w:rPr>
-          <w:rStyle w:val="NormalTok"/>
-        </w:rPr>
-        <w:t xml:space="preserve">              littersize</w:t>
-      </w:r>
-      <w:r>
-        <w:rPr>
-          <w:rStyle w:val="SpecialCharTok"/>
-        </w:rPr>
-        <w:t xml:space="preserve">*</w:t>
-      </w:r>
-      <w:r>
-        <w:rPr>
-          <w:rStyle w:val="NormalTok"/>
-        </w:rPr>
-        <w:t xml:space="preserve">density</w:t>
-      </w:r>
-      <w:r>
-        <w:rPr>
-          <w:rStyle w:val="SpecialCharTok"/>
-        </w:rPr>
-        <w:t xml:space="preserve">*</w:t>
-      </w:r>
-      <w:r>
-        <w:rPr>
-          <w:rStyle w:val="NormalTok"/>
-        </w:rPr>
-        <w:t xml:space="preserve">treatment_food </w:t>
-      </w:r>
-      <w:r>
-        <w:rPr>
-          <w:rStyle w:val="SpecialCharTok"/>
-        </w:rPr>
-        <w:t xml:space="preserve">+</w:t>
-      </w:r>
-      <w:r>
-        <w:br/>
-      </w:r>
-      <w:r>
-        <w:rPr>
-          <w:rStyle w:val="NormalTok"/>
-        </w:rPr>
-        <w:t xml:space="preserve">              mother_age </w:t>
-      </w:r>
-      <w:r>
-        <w:rPr>
-          <w:rStyle w:val="SpecialCharTok"/>
-        </w:rPr>
-        <w:t xml:space="preserve">+</w:t>
-      </w:r>
-      <w:r>
-        <w:rPr>
-          <w:rStyle w:val="NormalTok"/>
-        </w:rPr>
-        <w:t xml:space="preserve"> </w:t>
-      </w:r>
-      <w:r>
-        <w:br/>
-      </w:r>
-      <w:r>
-        <w:rPr>
-          <w:rStyle w:val="NormalTok"/>
-        </w:rPr>
-        <w:t xml:space="preserve">              mother_age</w:t>
-      </w:r>
-      <w:r>
-        <w:rPr>
-          <w:rStyle w:val="SpecialCharTok"/>
-        </w:rPr>
-        <w:t xml:space="preserve">^</w:t>
-      </w:r>
-      <w:r>
-        <w:rPr>
-          <w:rStyle w:val="DecValTok"/>
-        </w:rPr>
-        <w:t xml:space="preserve">2</w:t>
-      </w:r>
-      <w:r>
-        <w:rPr>
-          <w:rStyle w:val="NormalTok"/>
-        </w:rPr>
-        <w:t xml:space="preserve"> </w:t>
-      </w:r>
-      <w:r>
-        <w:rPr>
-          <w:rStyle w:val="SpecialCharTok"/>
-        </w:rPr>
-        <w:t xml:space="preserve">+</w:t>
-      </w:r>
-      <w:r>
-        <w:br/>
-      </w:r>
-      <w:r>
-        <w:rPr>
-          <w:rStyle w:val="NormalTok"/>
-        </w:rPr>
-        <w:t xml:space="preserve">              sex </w:t>
-      </w:r>
-      <w:r>
-        <w:rPr>
-          <w:rStyle w:val="SpecialCharTok"/>
-        </w:rPr>
-        <w:t xml:space="preserve">+</w:t>
-      </w:r>
-      <w:r>
-        <w:rPr>
-          <w:rStyle w:val="NormalTok"/>
-        </w:rPr>
-        <w:t xml:space="preserve"> </w:t>
-      </w:r>
-      <w:r>
-        <w:br/>
-      </w:r>
-      <w:r>
-        <w:rPr>
-          <w:rStyle w:val="NormalTok"/>
-        </w:rPr>
-        <w:t xml:space="preserve">              mast </w:t>
-      </w:r>
-      <w:r>
-        <w:rPr>
-          <w:rStyle w:val="SpecialCharTok"/>
-        </w:rPr>
-        <w:t xml:space="preserve">+</w:t>
-      </w:r>
-      <w:r>
-        <w:rPr>
-          <w:rStyle w:val="NormalTok"/>
-        </w:rPr>
-        <w:t xml:space="preserve"> </w:t>
-      </w:r>
-      <w:r>
-        <w:br/>
-      </w:r>
-      <w:r>
-        <w:rPr>
-          <w:rStyle w:val="NormalTok"/>
-        </w:rPr>
-        <w:t xml:space="preserve">              bjulian </w:t>
-      </w:r>
-      <w:r>
-        <w:rPr>
-          <w:rStyle w:val="SpecialCharTok"/>
-        </w:rPr>
-        <w:t xml:space="preserve">+</w:t>
-      </w:r>
-      <w:r>
-        <w:rPr>
-          <w:rStyle w:val="NormalTok"/>
-        </w:rPr>
-        <w:t xml:space="preserve"> </w:t>
-      </w:r>
-      <w:r>
-        <w:br/>
-      </w:r>
-      <w:r>
-        <w:rPr>
-          <w:rStyle w:val="NormalTok"/>
-        </w:rPr>
-        <w:t xml:space="preserve">              (</w:t>
-      </w:r>
-      <w:r>
-        <w:rPr>
-          <w:rStyle w:val="DecValTok"/>
-        </w:rPr>
-        <w:t xml:space="preserve">1</w:t>
-      </w:r>
-      <w:r>
-        <w:rPr>
-          <w:rStyle w:val="SpecialCharTok"/>
-        </w:rPr>
-        <w:t xml:space="preserve">|</w:t>
-      </w:r>
-      <w:r>
-        <w:rPr>
-          <w:rStyle w:val="NormalTok"/>
-        </w:rPr>
-        <w:t xml:space="preserve">mother_id</w:t>
-      </w:r>
-      <w:r>
-        <w:rPr>
-          <w:rStyle w:val="SpecialCharTok"/>
-        </w:rPr>
-        <w:t xml:space="preserve">/</w:t>
-      </w:r>
-      <w:r>
-        <w:rPr>
-          <w:rStyle w:val="NormalTok"/>
-        </w:rPr>
-        <w:t xml:space="preserve">litter_id) </w:t>
-      </w:r>
-      <w:r>
-        <w:rPr>
-          <w:rStyle w:val="SpecialCharTok"/>
-        </w:rPr>
-        <w:t xml:space="preserve">+</w:t>
-      </w:r>
-      <w:r>
-        <w:br/>
-      </w:r>
-      <w:r>
-        <w:rPr>
-          <w:rStyle w:val="NormalTok"/>
-        </w:rPr>
-        <w:t xml:space="preserve">              (</w:t>
-      </w:r>
-      <w:r>
-        <w:rPr>
-          <w:rStyle w:val="DecValTok"/>
-        </w:rPr>
-        <w:t xml:space="preserve">1</w:t>
-      </w:r>
-      <w:r>
-        <w:rPr>
-          <w:rStyle w:val="SpecialCharTok"/>
-        </w:rPr>
-        <w:t xml:space="preserve">|</w:t>
-      </w:r>
-      <w:r>
-        <w:rPr>
-          <w:rStyle w:val="NormalTok"/>
-        </w:rPr>
-        <w:t xml:space="preserve">year), </w:t>
-      </w:r>
-      <w:r>
-        <w:br/>
-      </w:r>
-      <w:r>
-        <w:rPr>
-          <w:rStyle w:val="NormalTok"/>
-        </w:rPr>
-        <w:t xml:space="preserve">            food)</w:t>
-      </w:r>
-      <w:r>
-        <w:br/>
-      </w:r>
-      <w:r>
-        <w:br/>
-      </w:r>
-      <w:r>
-        <w:rPr>
-          <w:rStyle w:val="CommentTok"/>
-        </w:rPr>
-        <w:t xml:space="preserve">#summaries</w:t>
-      </w:r>
-      <w:r>
-        <w:br/>
-      </w:r>
-      <w:r>
-        <w:rPr>
-          <w:rStyle w:val="FunctionTok"/>
-        </w:rPr>
-        <w:t xml:space="preserve">anova</w:t>
-      </w:r>
-      <w:r>
-        <w:rPr>
-          <w:rStyle w:val="NormalTok"/>
-        </w:rPr>
-        <w:t xml:space="preserve">(mixmod)</w:t>
-      </w:r>
-    </w:p>
-    <w:p>
-      <w:pPr>
-        <w:pStyle w:val="SourceCode"/>
-      </w:pPr>
-      <w:r>
-        <w:rPr>
-          <w:rStyle w:val="VerbatimChar"/>
-        </w:rPr>
-        <w:t xml:space="preserve">## Analysis of Variance Table</w:t>
-      </w:r>
-      <w:r>
-        <w:br/>
-      </w:r>
-      <w:r>
-        <w:rPr>
-          <w:rStyle w:val="VerbatimChar"/>
-        </w:rPr>
-        <w:t xml:space="preserve">##                                   npar Sum Sq Mean Sq  F value</w:t>
-      </w:r>
-      <w:r>
-        <w:br/>
-      </w:r>
-      <w:r>
-        <w:rPr>
-          <w:rStyle w:val="VerbatimChar"/>
-        </w:rPr>
-        <w:t xml:space="preserve">## littersize                           1 4.2101  4.2101 127.4264</w:t>
-      </w:r>
-      <w:r>
-        <w:br/>
-      </w:r>
-      <w:r>
-        <w:rPr>
-          <w:rStyle w:val="VerbatimChar"/>
-        </w:rPr>
-        <w:t xml:space="preserve">## density                              1 0.0769  0.0769   2.3269</w:t>
-      </w:r>
-      <w:r>
-        <w:br/>
-      </w:r>
-      <w:r>
-        <w:rPr>
-          <w:rStyle w:val="VerbatimChar"/>
-        </w:rPr>
-        <w:t xml:space="preserve">## treatment_food                       2 0.6441  0.3220   9.7468</w:t>
-      </w:r>
-      <w:r>
-        <w:br/>
-      </w:r>
-      <w:r>
-        <w:rPr>
-          <w:rStyle w:val="VerbatimChar"/>
-        </w:rPr>
-        <w:t xml:space="preserve">## mother_age                           1 0.0189  0.0189   0.5706</w:t>
-      </w:r>
-      <w:r>
-        <w:br/>
-      </w:r>
-      <w:r>
-        <w:rPr>
-          <w:rStyle w:val="VerbatimChar"/>
-        </w:rPr>
-        <w:t xml:space="preserve">## sex                                  1 0.8029  0.8029  24.3000</w:t>
-      </w:r>
-      <w:r>
-        <w:br/>
-      </w:r>
-      <w:r>
-        <w:rPr>
-          <w:rStyle w:val="VerbatimChar"/>
-        </w:rPr>
-        <w:t xml:space="preserve">## mast                                 1 0.0161  0.0161   0.4859</w:t>
-      </w:r>
-      <w:r>
-        <w:br/>
-      </w:r>
-      <w:r>
-        <w:rPr>
-          <w:rStyle w:val="VerbatimChar"/>
-        </w:rPr>
-        <w:t xml:space="preserve">## bjulian                              1 2.4690  2.4690  74.7285</w:t>
-      </w:r>
-      <w:r>
-        <w:br/>
-      </w:r>
-      <w:r>
-        <w:rPr>
-          <w:rStyle w:val="VerbatimChar"/>
-        </w:rPr>
-        <w:t xml:space="preserve">## littersize:density                   1 0.0569  0.0569   1.7227</w:t>
-      </w:r>
-      <w:r>
-        <w:br/>
-      </w:r>
-      <w:r>
-        <w:rPr>
-          <w:rStyle w:val="VerbatimChar"/>
-        </w:rPr>
-        <w:t xml:space="preserve">## littersize:treatment_food            2 0.2057  0.1028   3.1123</w:t>
-      </w:r>
-      <w:r>
-        <w:br/>
-      </w:r>
-      <w:r>
-        <w:rPr>
-          <w:rStyle w:val="VerbatimChar"/>
-        </w:rPr>
-        <w:t xml:space="preserve">## density:treatment_food               2 0.0727  0.0363   1.0996</w:t>
-      </w:r>
-      <w:r>
-        <w:br/>
-      </w:r>
-      <w:r>
-        <w:rPr>
-          <w:rStyle w:val="VerbatimChar"/>
-        </w:rPr>
-        <w:t xml:space="preserve">## littersize:density:treatment_food    2 0.1268  0.0634   1.9182</w:t>
-      </w:r>
-    </w:p>
-    <w:p>
-      <w:pPr>
-        <w:pStyle w:val="SourceCode"/>
-      </w:pPr>
-      <w:r>
-        <w:rPr>
-          <w:rStyle w:val="CommentTok"/>
-        </w:rPr>
-        <w:t xml:space="preserve">#get effects table for model</w:t>
-      </w:r>
-      <w:r>
-        <w:br/>
-      </w:r>
-      <w:r>
-        <w:rPr>
-          <w:rStyle w:val="NormalTok"/>
-        </w:rPr>
-        <w:t xml:space="preserve">mix_effs </w:t>
-      </w:r>
-      <w:r>
-        <w:rPr>
-          <w:rStyle w:val="OtherTok"/>
-        </w:rPr>
-        <w:t xml:space="preserve">&lt;-</w:t>
-      </w:r>
-      <w:r>
-        <w:rPr>
-          <w:rStyle w:val="NormalTok"/>
-        </w:rPr>
-        <w:t xml:space="preserve"> </w:t>
-      </w:r>
-      <w:r>
-        <w:rPr>
-          <w:rStyle w:val="FunctionTok"/>
-        </w:rPr>
-        <w:t xml:space="preserve">as.data.table</w:t>
-      </w:r>
-      <w:r>
-        <w:rPr>
-          <w:rStyle w:val="NormalTok"/>
-        </w:rPr>
-        <w:t xml:space="preserve">(</w:t>
-      </w:r>
-      <w:r>
-        <w:rPr>
-          <w:rStyle w:val="FunctionTok"/>
-        </w:rPr>
-        <w:t xml:space="preserve">ggpredict</w:t>
-      </w:r>
-      <w:r>
-        <w:rPr>
-          <w:rStyle w:val="NormalTok"/>
-        </w:rPr>
-        <w:t xml:space="preserve">(mixmod, </w:t>
-      </w:r>
-      <w:r>
-        <w:rPr>
-          <w:rStyle w:val="AttributeTok"/>
-        </w:rPr>
-        <w:t xml:space="preserve">terms =</w:t>
-      </w:r>
-      <w:r>
-        <w:rPr>
-          <w:rStyle w:val="NormalTok"/>
-        </w:rPr>
-        <w:t xml:space="preserve"> </w:t>
-      </w:r>
-      <w:r>
-        <w:rPr>
-          <w:rStyle w:val="FunctionTok"/>
-        </w:rPr>
-        <w:t xml:space="preserve">c</w:t>
-      </w:r>
-      <w:r>
-        <w:rPr>
-          <w:rStyle w:val="NormalTok"/>
-        </w:rPr>
-        <w:t xml:space="preserve">(</w:t>
-      </w:r>
-      <w:r>
-        <w:rPr>
-          <w:rStyle w:val="StringTok"/>
-        </w:rPr>
-        <w:t xml:space="preserve">"littersize"</w:t>
-      </w:r>
-      <w:r>
-        <w:rPr>
-          <w:rStyle w:val="NormalTok"/>
-        </w:rPr>
-        <w:t xml:space="preserve">, </w:t>
-      </w:r>
-      <w:r>
-        <w:rPr>
-          <w:rStyle w:val="StringTok"/>
-        </w:rPr>
-        <w:t xml:space="preserve">"density"</w:t>
-      </w:r>
-      <w:r>
-        <w:rPr>
-          <w:rStyle w:val="NormalTok"/>
-        </w:rPr>
-        <w:t xml:space="preserve">, </w:t>
-      </w:r>
-      <w:r>
-        <w:rPr>
-          <w:rStyle w:val="StringTok"/>
-        </w:rPr>
-        <w:t xml:space="preserve">"treatment_food"</w:t>
-      </w:r>
-      <w:r>
-        <w:rPr>
-          <w:rStyle w:val="NormalTok"/>
-        </w:rPr>
-        <w:t xml:space="preserve">)))</w:t>
-      </w:r>
-      <w:r>
-        <w:br/>
-      </w:r>
-      <w:r>
-        <w:br/>
-      </w:r>
-      <w:r>
-        <w:rPr>
-          <w:rStyle w:val="FunctionTok"/>
-        </w:rPr>
-        <w:t xml:space="preserve">ggplot</w:t>
-      </w:r>
-      <w:r>
-        <w:rPr>
-          <w:rStyle w:val="NormalTok"/>
-        </w:rPr>
-        <w:t xml:space="preserve">(mix_effs)</w:t>
-      </w:r>
-      <w:r>
-        <w:rPr>
-          <w:rStyle w:val="SpecialCharTok"/>
-        </w:rPr>
-        <w:t xml:space="preserve">+</w:t>
-      </w:r>
-      <w:r>
-        <w:br/>
-      </w:r>
-      <w:r>
-        <w:rPr>
-          <w:rStyle w:val="NormalTok"/>
-        </w:rPr>
-        <w:t xml:space="preserve">  </w:t>
-      </w:r>
-      <w:r>
-        <w:rPr>
-          <w:rStyle w:val="FunctionTok"/>
-        </w:rPr>
-        <w:t xml:space="preserve">geom_ribbon</w:t>
-      </w:r>
-      <w:r>
-        <w:rPr>
-          <w:rStyle w:val="NormalTok"/>
-        </w:rPr>
-        <w:t xml:space="preserve">(</w:t>
-      </w:r>
-      <w:r>
-        <w:rPr>
-          <w:rStyle w:val="FunctionTok"/>
-        </w:rPr>
-        <w:t xml:space="preserve">aes</w:t>
-      </w:r>
-      <w:r>
-        <w:rPr>
-          <w:rStyle w:val="NormalTok"/>
-        </w:rPr>
-        <w:t xml:space="preserve">(</w:t>
-      </w:r>
-      <w:r>
-        <w:rPr>
-          <w:rStyle w:val="AttributeTok"/>
-        </w:rPr>
-        <w:t xml:space="preserve">x =</w:t>
-      </w:r>
-      <w:r>
-        <w:rPr>
-          <w:rStyle w:val="NormalTok"/>
-        </w:rPr>
-        <w:t xml:space="preserve"> x, </w:t>
-      </w:r>
-      <w:r>
-        <w:rPr>
-          <w:rStyle w:val="AttributeTok"/>
-        </w:rPr>
-        <w:t xml:space="preserve">ymin =</w:t>
-      </w:r>
-      <w:r>
-        <w:rPr>
-          <w:rStyle w:val="NormalTok"/>
-        </w:rPr>
-        <w:t xml:space="preserve"> conf.low, </w:t>
-      </w:r>
-      <w:r>
-        <w:rPr>
-          <w:rStyle w:val="AttributeTok"/>
-        </w:rPr>
-        <w:t xml:space="preserve">ymax =</w:t>
-      </w:r>
-      <w:r>
-        <w:rPr>
-          <w:rStyle w:val="NormalTok"/>
-        </w:rPr>
-        <w:t xml:space="preserve"> conf.high, </w:t>
-      </w:r>
-      <w:r>
-        <w:rPr>
-          <w:rStyle w:val="AttributeTok"/>
-        </w:rPr>
-        <w:t xml:space="preserve">group =</w:t>
-      </w:r>
-      <w:r>
-        <w:rPr>
-          <w:rStyle w:val="NormalTok"/>
-        </w:rPr>
-        <w:t xml:space="preserve"> group, </w:t>
-      </w:r>
-      <w:r>
-        <w:rPr>
-          <w:rStyle w:val="AttributeTok"/>
-        </w:rPr>
-        <w:t xml:space="preserve">fill =</w:t>
-      </w:r>
-      <w:r>
-        <w:rPr>
-          <w:rStyle w:val="NormalTok"/>
-        </w:rPr>
-        <w:t xml:space="preserve"> group), </w:t>
-      </w:r>
-      <w:r>
-        <w:rPr>
-          <w:rStyle w:val="AttributeTok"/>
-        </w:rPr>
-        <w:t xml:space="preserve">alpha =</w:t>
-      </w:r>
-      <w:r>
-        <w:rPr>
-          <w:rStyle w:val="NormalTok"/>
-        </w:rPr>
-        <w:t xml:space="preserve"> </w:t>
-      </w:r>
-      <w:r>
-        <w:rPr>
-          <w:rStyle w:val="FloatTok"/>
-        </w:rPr>
-        <w:t xml:space="preserve">0.2</w:t>
-      </w:r>
-      <w:r>
-        <w:rPr>
-          <w:rStyle w:val="NormalTok"/>
-        </w:rPr>
-        <w:t xml:space="preserve">)</w:t>
-      </w:r>
-      <w:r>
-        <w:rPr>
-          <w:rStyle w:val="SpecialCharTok"/>
-        </w:rPr>
-        <w:t xml:space="preserve">+</w:t>
-      </w:r>
-      <w:r>
-        <w:br/>
-      </w:r>
-      <w:r>
-        <w:rPr>
-          <w:rStyle w:val="NormalTok"/>
-        </w:rPr>
-        <w:t xml:space="preserve">  </w:t>
-      </w:r>
-      <w:r>
-        <w:rPr>
-          <w:rStyle w:val="FunctionTok"/>
-        </w:rPr>
-        <w:t xml:space="preserve">geom_line</w:t>
-      </w:r>
-      <w:r>
-        <w:rPr>
-          <w:rStyle w:val="NormalTok"/>
-        </w:rPr>
-        <w:t xml:space="preserve">(</w:t>
-      </w:r>
-      <w:r>
-        <w:rPr>
-          <w:rStyle w:val="FunctionTok"/>
-        </w:rPr>
-        <w:t xml:space="preserve">aes</w:t>
-      </w:r>
-      <w:r>
-        <w:rPr>
-          <w:rStyle w:val="NormalTok"/>
-        </w:rPr>
-        <w:t xml:space="preserve">(</w:t>
-      </w:r>
-      <w:r>
-        <w:rPr>
-          <w:rStyle w:val="AttributeTok"/>
-        </w:rPr>
-        <w:t xml:space="preserve">y =</w:t>
-      </w:r>
-      <w:r>
-        <w:rPr>
-          <w:rStyle w:val="NormalTok"/>
-        </w:rPr>
-        <w:t xml:space="preserve"> predicted, </w:t>
-      </w:r>
-      <w:r>
-        <w:rPr>
-          <w:rStyle w:val="AttributeTok"/>
-        </w:rPr>
-        <w:t xml:space="preserve">x =</w:t>
-      </w:r>
-      <w:r>
-        <w:rPr>
-          <w:rStyle w:val="NormalTok"/>
-        </w:rPr>
-        <w:t xml:space="preserve"> x, </w:t>
-      </w:r>
-      <w:r>
-        <w:rPr>
-          <w:rStyle w:val="AttributeTok"/>
-        </w:rPr>
-        <w:t xml:space="preserve">color =</w:t>
-      </w:r>
-      <w:r>
-        <w:rPr>
-          <w:rStyle w:val="NormalTok"/>
-        </w:rPr>
-        <w:t xml:space="preserve"> group, </w:t>
-      </w:r>
-      <w:r>
-        <w:rPr>
-          <w:rStyle w:val="AttributeTok"/>
-        </w:rPr>
-        <w:t xml:space="preserve">group =</w:t>
-      </w:r>
-      <w:r>
-        <w:rPr>
-          <w:rStyle w:val="NormalTok"/>
-        </w:rPr>
-        <w:t xml:space="preserve"> group), </w:t>
-      </w:r>
-      <w:r>
-        <w:rPr>
-          <w:rStyle w:val="AttributeTok"/>
-        </w:rPr>
-        <w:t xml:space="preserve">linewidth =</w:t>
-      </w:r>
-      <w:r>
-        <w:rPr>
-          <w:rStyle w:val="NormalTok"/>
-        </w:rPr>
-        <w:t xml:space="preserve"> </w:t>
-      </w:r>
-      <w:r>
-        <w:rPr>
-          <w:rStyle w:val="DecValTok"/>
-        </w:rPr>
-        <w:t xml:space="preserve">1</w:t>
-      </w:r>
-      <w:r>
-        <w:rPr>
-          <w:rStyle w:val="NormalTok"/>
-        </w:rPr>
-        <w:t xml:space="preserve">)</w:t>
-      </w:r>
-      <w:r>
-        <w:rPr>
-          <w:rStyle w:val="SpecialCharTok"/>
-        </w:rPr>
-        <w:t xml:space="preserve">+</w:t>
-      </w:r>
-      <w:r>
-        <w:br/>
-      </w:r>
-      <w:r>
-        <w:rPr>
-          <w:rStyle w:val="NormalTok"/>
-        </w:rPr>
-        <w:t xml:space="preserve">  </w:t>
-      </w:r>
-      <w:r>
-        <w:rPr>
-          <w:rStyle w:val="FunctionTok"/>
-        </w:rPr>
-        <w:t xml:space="preserve">scale_color_discrete</w:t>
-      </w:r>
-      <w:r>
-        <w:rPr>
-          <w:rStyle w:val="NormalTok"/>
-        </w:rPr>
-        <w:t xml:space="preserve">(</w:t>
-      </w:r>
-      <w:r>
-        <w:rPr>
-          <w:rStyle w:val="AttributeTok"/>
-        </w:rPr>
-        <w:t xml:space="preserve">name =</w:t>
-      </w:r>
-      <w:r>
-        <w:rPr>
-          <w:rStyle w:val="NormalTok"/>
-        </w:rPr>
-        <w:t xml:space="preserve"> </w:t>
-      </w:r>
-      <w:r>
-        <w:rPr>
-          <w:rStyle w:val="StringTok"/>
-        </w:rPr>
-        <w:t xml:space="preserve">"Density (ind/ha)"</w:t>
-      </w:r>
-      <w:r>
-        <w:rPr>
-          <w:rStyle w:val="NormalTok"/>
-        </w:rPr>
-        <w:t xml:space="preserve">)</w:t>
-      </w:r>
-      <w:r>
-        <w:rPr>
-          <w:rStyle w:val="SpecialCharTok"/>
-        </w:rPr>
-        <w:t xml:space="preserve">+</w:t>
-      </w:r>
-      <w:r>
-        <w:br/>
-      </w:r>
-      <w:r>
-        <w:rPr>
-          <w:rStyle w:val="NormalTok"/>
-        </w:rPr>
-        <w:t xml:space="preserve">  </w:t>
-      </w:r>
-      <w:r>
-        <w:rPr>
-          <w:rStyle w:val="FunctionTok"/>
-        </w:rPr>
-        <w:t xml:space="preserve">scale_fill_discrete</w:t>
-      </w:r>
-      <w:r>
-        <w:rPr>
-          <w:rStyle w:val="NormalTok"/>
-        </w:rPr>
-        <w:t xml:space="preserve">(</w:t>
-      </w:r>
-      <w:r>
-        <w:rPr>
-          <w:rStyle w:val="AttributeTok"/>
-        </w:rPr>
-        <w:t xml:space="preserve">name =</w:t>
-      </w:r>
-      <w:r>
-        <w:rPr>
-          <w:rStyle w:val="NormalTok"/>
-        </w:rPr>
-        <w:t xml:space="preserve"> </w:t>
-      </w:r>
-      <w:r>
-        <w:rPr>
-          <w:rStyle w:val="StringTok"/>
-        </w:rPr>
-        <w:t xml:space="preserve">"Density (ind/ha)"</w:t>
-      </w:r>
-      <w:r>
-        <w:rPr>
-          <w:rStyle w:val="NormalTok"/>
-        </w:rPr>
-        <w:t xml:space="preserve">)</w:t>
-      </w:r>
-      <w:r>
-        <w:rPr>
-          <w:rStyle w:val="SpecialCharTok"/>
-        </w:rPr>
-        <w:t xml:space="preserve">+</w:t>
-      </w:r>
-      <w:r>
-        <w:br/>
-      </w:r>
-      <w:r>
-        <w:rPr>
-          <w:rStyle w:val="NormalTok"/>
-        </w:rPr>
-        <w:t xml:space="preserve">  </w:t>
-      </w:r>
-      <w:r>
-        <w:rPr>
-          <w:rStyle w:val="FunctionTok"/>
-        </w:rPr>
-        <w:t xml:space="preserve">labs</w:t>
-      </w:r>
-      <w:r>
-        <w:rPr>
-          <w:rStyle w:val="NormalTok"/>
-        </w:rPr>
-        <w:t xml:space="preserve">(</w:t>
-      </w:r>
-      <w:r>
-        <w:rPr>
-          <w:rStyle w:val="AttributeTok"/>
-        </w:rPr>
-        <w:t xml:space="preserve">x =</w:t>
-      </w:r>
-      <w:r>
-        <w:rPr>
-          <w:rStyle w:val="NormalTok"/>
-        </w:rPr>
-        <w:t xml:space="preserve"> </w:t>
-      </w:r>
-      <w:r>
-        <w:rPr>
-          <w:rStyle w:val="StringTok"/>
-        </w:rPr>
-        <w:t xml:space="preserve">"Litter size"</w:t>
-      </w:r>
-      <w:r>
-        <w:rPr>
-          <w:rStyle w:val="NormalTok"/>
-        </w:rPr>
-        <w:t xml:space="preserve">, </w:t>
-      </w:r>
-      <w:r>
-        <w:rPr>
-          <w:rStyle w:val="AttributeTok"/>
-        </w:rPr>
-        <w:t xml:space="preserve">y =</w:t>
-      </w:r>
-      <w:r>
-        <w:rPr>
-          <w:rStyle w:val="NormalTok"/>
-        </w:rPr>
-        <w:t xml:space="preserve"> </w:t>
-      </w:r>
-      <w:r>
-        <w:rPr>
-          <w:rStyle w:val="StringTok"/>
-        </w:rPr>
-        <w:t xml:space="preserve">"Growth rate (g/day)"</w:t>
-      </w:r>
-      <w:r>
-        <w:rPr>
-          <w:rStyle w:val="NormalTok"/>
-        </w:rPr>
-        <w:t xml:space="preserve">, </w:t>
-      </w:r>
-      <w:r>
-        <w:rPr>
-          <w:rStyle w:val="AttributeTok"/>
-        </w:rPr>
-        <w:t xml:space="preserve">subtitle =</w:t>
-      </w:r>
-      <w:r>
-        <w:rPr>
-          <w:rStyle w:val="NormalTok"/>
-        </w:rPr>
-        <w:t xml:space="preserve"> </w:t>
-      </w:r>
-      <w:r>
-        <w:rPr>
-          <w:rStyle w:val="StringTok"/>
-        </w:rPr>
-        <w:t xml:space="preserve">"Grid Treatment + Bucket"</w:t>
-      </w:r>
-      <w:r>
-        <w:rPr>
-          <w:rStyle w:val="NormalTok"/>
-        </w:rPr>
-        <w:t xml:space="preserve">)</w:t>
-      </w:r>
-      <w:r>
-        <w:rPr>
-          <w:rStyle w:val="SpecialCharTok"/>
-        </w:rPr>
-        <w:t xml:space="preserve">+</w:t>
-      </w:r>
-      <w:r>
-        <w:br/>
-      </w:r>
-      <w:r>
-        <w:rPr>
-          <w:rStyle w:val="NormalTok"/>
-        </w:rPr>
-        <w:t xml:space="preserve">  </w:t>
-      </w:r>
-      <w:r>
-        <w:rPr>
-          <w:rStyle w:val="FunctionTok"/>
-        </w:rPr>
-        <w:t xml:space="preserve">facet_wrap</w:t>
-      </w:r>
-      <w:r>
-        <w:rPr>
-          <w:rStyle w:val="NormalTok"/>
-        </w:rPr>
-        <w:t xml:space="preserve">(</w:t>
-      </w:r>
-      <w:r>
-        <w:rPr>
-          <w:rStyle w:val="SpecialCharTok"/>
-        </w:rPr>
-        <w:t xml:space="preserve">~</w:t>
-      </w:r>
-      <w:r>
-        <w:rPr>
-          <w:rStyle w:val="NormalTok"/>
-        </w:rPr>
-        <w:t xml:space="preserve">facet)</w:t>
-      </w:r>
-      <w:r>
-        <w:rPr>
-          <w:rStyle w:val="SpecialCharTok"/>
-        </w:rPr>
-        <w:t xml:space="preserve">+</w:t>
-      </w:r>
-      <w:r>
-        <w:br/>
-      </w:r>
-      <w:r>
-        <w:rPr>
-          <w:rStyle w:val="NormalTok"/>
-        </w:rPr>
-        <w:t xml:space="preserve">  </w:t>
-      </w:r>
-      <w:r>
-        <w:rPr>
-          <w:rStyle w:val="FunctionTok"/>
-        </w:rPr>
-        <w:t xml:space="preserve">theme_bw</w:t>
-      </w:r>
-      <w:r>
-        <w:rPr>
-          <w:rStyle w:val="NormalTok"/>
-        </w:rPr>
-        <w:t xml:space="preserve">()</w:t>
-      </w:r>
-    </w:p>
-    <w:p>
-      <w:pPr>
-        <w:pStyle w:val="FirstParagraph"/>
-      </w:pPr>
-      <w:r>
-        <w:drawing>
-          <wp:inline>
-            <wp:extent cx="4620126" cy="3696101"/>
-            <wp:effectExtent b="0" l="0" r="0" t="0"/>
-            <wp:docPr descr="" title="" id="19" name="Picture"/>
-            <a:graphic>
-              <a:graphicData uri="http://schemas.openxmlformats.org/drawingml/2006/picture">
-                <pic:pic>
-                  <pic:nvPicPr>
-                    <pic:cNvPr descr="Preliminary_results_files/Preliminary_results_files/figure-docx/fig 4-1.png" id="20" name="Picture"/>
-                    <pic:cNvPicPr>
-                      <a:picLocks noChangeArrowheads="1" noChangeAspect="1"/>
-                    </pic:cNvPicPr>
-                  </pic:nvPicPr>
-                  <pic:blipFill>
-                    <a:blip r:embed="rId18"/>
-                    <a:stretch>
-                      <a:fillRect/>
-                    </a:stretch>
-                  </pic:blipFill>
-                  <pic:spPr bwMode="auto">
-                    <a:xfrm>
-                      <a:off x="0" y="0"/>
-                      <a:ext cx="4620126" cy="3696101"/>
-                    </a:xfrm>
-                    <a:prstGeom prst="rect">
-                      <a:avLst/>
-                    </a:prstGeom>
-                    <a:noFill/>
-                    <a:ln w="9525">
-                      <a:noFill/>
-                      <a:headEnd/>
-                      <a:tailEnd/>
-                    </a:ln>
-                  </pic:spPr>
-                </pic:pic>
-              </a:graphicData>
-            </a:graphic>
-          </wp:inline>
-        </w:drawing>
-      </w:r>
-    </w:p>
-    <w:bookmarkEnd w:id="21"/>
+    <w:bookmarkEnd w:id="18"/>
     <w:sectPr>
       <w:footnotePr>
         <w:numRestart w:val="eachSect"/>

</xml_diff>